<commit_message>
more revisions to de-emphasize exogenous regressors
</commit_message>
<xml_diff>
--- a/app/report.docx
+++ b/app/report.docx
@@ -19,18 +19,18 @@
           <wp:inline>
             <wp:extent cx="5943600" cy="385265"/>
             <wp:effectExtent b="0" l="0" r="0" t="0"/>
-            <wp:docPr descr="" title="" id="21" name="Picture"/>
+            <wp:docPr descr="" title="" id="19" name="Picture"/>
             <a:graphic>
               <a:graphicData uri="http://schemas.openxmlformats.org/drawingml/2006/picture">
                 <pic:pic>
                   <pic:nvPicPr>
-                    <pic:cNvPr descr="www/report-header.png" id="22" name="Picture"/>
+                    <pic:cNvPr descr="www/report-header.png" id="20" name="Picture"/>
                     <pic:cNvPicPr>
                       <a:picLocks noChangeArrowheads="1" noChangeAspect="1"/>
                     </pic:cNvPicPr>
                   </pic:nvPicPr>
                   <pic:blipFill>
-                    <a:blip r:embed="rId20"/>
+                    <a:blip r:embed="rId18"/>
                     <a:stretch>
                       <a:fillRect/>
                     </a:stretch>
@@ -64,7 +64,7 @@
         </w:pict>
       </w:r>
     </w:p>
-    <w:bookmarkStart w:id="23" w:name="name"/>
+    <w:bookmarkStart w:id="21" w:name="name"/>
     <w:p>
       <w:pPr>
         <w:pStyle w:val="Heading3"/>
@@ -73,8 +73,8 @@
         <w:t xml:space="preserve">Name:</w:t>
       </w:r>
     </w:p>
-    <w:bookmarkEnd w:id="23"/>
-    <w:bookmarkStart w:id="26" w:name="student-id"/>
+    <w:bookmarkEnd w:id="21"/>
+    <w:bookmarkStart w:id="24" w:name="student-id"/>
     <w:p>
       <w:pPr>
         <w:pStyle w:val="Heading3"/>
@@ -83,7 +83,7 @@
         <w:t xml:space="preserve">Student ID:</w:t>
       </w:r>
     </w:p>
-    <w:bookmarkStart w:id="24" w:name="completed-on"/>
+    <w:bookmarkStart w:id="22" w:name="completed-on"/>
     <w:p>
       <w:pPr>
         <w:pStyle w:val="Heading4"/>
@@ -92,8 +92,8 @@
         <w:t xml:space="preserve">Completed on:</w:t>
       </w:r>
     </w:p>
-    <w:bookmarkEnd w:id="24"/>
-    <w:bookmarkStart w:id="25" w:name="X3a6046c5a849d0e9565efa4e116432c20e7a420"/>
+    <w:bookmarkEnd w:id="22"/>
+    <w:bookmarkStart w:id="23" w:name="X3a6046c5a849d0e9565efa4e116432c20e7a420"/>
     <w:p>
       <w:pPr>
         <w:pStyle w:val="Heading4"/>
@@ -109,9 +109,9 @@
         </w:pict>
       </w:r>
     </w:p>
-    <w:bookmarkEnd w:id="25"/>
-    <w:bookmarkEnd w:id="26"/>
-    <w:bookmarkStart w:id="27" w:name="Xcd761b2de2a3940df1151e21a9a4c3395d21e0e"/>
+    <w:bookmarkEnd w:id="23"/>
+    <w:bookmarkEnd w:id="24"/>
+    <w:bookmarkStart w:id="25" w:name="Xcd761b2de2a3940df1151e21a9a4c3395d21e0e"/>
     <w:p>
       <w:pPr>
         <w:pStyle w:val="Heading1"/>
@@ -124,8 +124,8 @@
         <w:t xml:space="preserve">Macrosystems EDDIE Module 11: Time Series Modeling and Prediction of Environmental Data</w:t>
       </w:r>
     </w:p>
-    <w:bookmarkEnd w:id="27"/>
-    <w:bookmarkStart w:id="28" w:name="learning-objectives"/>
+    <w:bookmarkEnd w:id="25"/>
+    <w:bookmarkStart w:id="26" w:name="learning-objectives"/>
     <w:p>
       <w:pPr>
         <w:pStyle w:val="Heading1"/>
@@ -202,8 +202,8 @@
         <w:t xml:space="preserve">Compare multiple time series models to assess their performance on out-of-sample predictions.</w:t>
       </w:r>
     </w:p>
-    <w:bookmarkEnd w:id="28"/>
-    <w:bookmarkStart w:id="40" w:name="summary"/>
+    <w:bookmarkEnd w:id="26"/>
+    <w:bookmarkStart w:id="38" w:name="summary"/>
     <w:p>
       <w:pPr>
         <w:pStyle w:val="Heading1"/>
@@ -228,7 +228,7 @@
         <w:t xml:space="preserve">In this module, students will apply several different time series and machine learning models to explore, analyze, and interpret environmental data. They will explore data from an environmental case study of their choice, choose which environmental variables to use to fit a time series model, assess the model, and apply the model to make predictions of future ecosystem conditions. Then, students will process a new dataset into a standardized format, upload it into the module’s R Shiny App, and fit several other models to compare predictive performance across models. Students will also evaluate the ecological understanding that can be drawn from each model (e.g., which driver variables are important for explaining the dynamics of the target environmental variable being predicted).</w:t>
       </w:r>
     </w:p>
-    <w:bookmarkStart w:id="29" w:name="module-overview"/>
+    <w:bookmarkStart w:id="27" w:name="module-overview"/>
     <w:p>
       <w:pPr>
         <w:pStyle w:val="Heading2"/>
@@ -285,8 +285,8 @@
         <w:t xml:space="preserve">Activity C: Students fit additional time series models to the environmental dataset used in Activity B and compare performance across models.</w:t>
       </w:r>
     </w:p>
-    <w:bookmarkEnd w:id="29"/>
-    <w:bookmarkStart w:id="30" w:name="X1e65beed4e0ca487c1cdf18f90c981a275640ae"/>
+    <w:bookmarkEnd w:id="27"/>
+    <w:bookmarkStart w:id="28" w:name="X1e65beed4e0ca487c1cdf18f90c981a275640ae"/>
     <w:p>
       <w:pPr>
         <w:pStyle w:val="Heading2"/>
@@ -337,8 +337,8 @@
         <w:t xml:space="preserve">The target variable for the NEON dataset will be net ecosystem exchange (NEE), a measure of carbon dioxide flux from ecosystems. NEE indicates whether an ecosystem is emitting or taking up carbon dioxide, and how this changes over time.</w:t>
       </w:r>
     </w:p>
-    <w:bookmarkEnd w:id="30"/>
-    <w:bookmarkStart w:id="32" w:name="r-shiny-app"/>
+    <w:bookmarkEnd w:id="28"/>
+    <w:bookmarkStart w:id="30" w:name="r-shiny-app"/>
     <w:p>
       <w:pPr>
         <w:pStyle w:val="Heading2"/>
@@ -357,7 +357,7 @@
       <w:r>
         <w:t xml:space="preserve"> </w:t>
       </w:r>
-      <w:hyperlink r:id="rId31">
+      <w:hyperlink r:id="rId29">
         <w:r>
           <w:rPr>
             <w:rStyle w:val="Hyperlink"/>
@@ -372,8 +372,8 @@
         <w:t xml:space="preserve">This can be accessed via any internet browser and allows you to navigate through the lesson via this app. You will fill in the questions below on this handout as you complete the lesson activities.</w:t>
       </w:r>
     </w:p>
-    <w:bookmarkEnd w:id="32"/>
-    <w:bookmarkStart w:id="35" w:name="optional-pre-class-readings-and-videos"/>
+    <w:bookmarkEnd w:id="30"/>
+    <w:bookmarkStart w:id="33" w:name="optional-pre-class-readings-and-videos"/>
     <w:p>
       <w:pPr>
         <w:pStyle w:val="Heading2"/>
@@ -395,7 +395,7 @@
       <w:r>
         <w:t xml:space="preserve"> </w:t>
       </w:r>
-      <w:hyperlink r:id="rId33">
+      <w:hyperlink r:id="rId31">
         <w:r>
           <w:rPr>
             <w:rStyle w:val="Hyperlink"/>
@@ -417,7 +417,7 @@
       <w:r>
         <w:t xml:space="preserve"> </w:t>
       </w:r>
-      <w:hyperlink r:id="rId34">
+      <w:hyperlink r:id="rId32">
         <w:r>
           <w:rPr>
             <w:rStyle w:val="Hyperlink"/>
@@ -434,8 +434,8 @@
         <w:br w:type="page"/>
       </w:r>
     </w:p>
-    <w:bookmarkEnd w:id="35"/>
-    <w:bookmarkStart w:id="39" w:name="X633e181b9eee9b02844a9ca1915b9beeff8a7be"/>
+    <w:bookmarkEnd w:id="33"/>
+    <w:bookmarkStart w:id="37" w:name="X633e181b9eee9b02844a9ca1915b9beeff8a7be"/>
     <w:p>
       <w:pPr>
         <w:pStyle w:val="Heading2"/>
@@ -475,7 +475,7 @@
       <w:r>
         <w:t xml:space="preserve"> </w:t>
       </w:r>
-      <w:hyperlink r:id="rId36">
+      <w:hyperlink r:id="rId34">
         <w:r>
           <w:rPr>
             <w:rStyle w:val="Hyperlink"/>
@@ -516,7 +516,7 @@
       <w:r>
         <w:t xml:space="preserve"> </w:t>
       </w:r>
-      <w:hyperlink r:id="rId37">
+      <w:hyperlink r:id="rId35">
         <w:r>
           <w:rPr>
             <w:rStyle w:val="Hyperlink"/>
@@ -533,7 +533,7 @@
         <w:br/>
       </w:r>
     </w:p>
-    <w:bookmarkStart w:id="38" w:name="Xdeed61ac86cf6788300129adc61f38518fe7ca8"/>
+    <w:bookmarkStart w:id="36" w:name="Xdeed61ac86cf6788300129adc61f38518fe7ca8"/>
     <w:p>
       <w:pPr>
         <w:pStyle w:val="Heading4"/>
@@ -650,10 +650,10 @@
         <w:br w:type="page"/>
       </w:r>
     </w:p>
+    <w:bookmarkEnd w:id="36"/>
+    <w:bookmarkEnd w:id="37"/>
     <w:bookmarkEnd w:id="38"/>
-    <w:bookmarkEnd w:id="39"/>
-    <w:bookmarkEnd w:id="40"/>
-    <w:bookmarkStart w:id="43" w:name="introduction"/>
+    <w:bookmarkStart w:id="41" w:name="introduction"/>
     <w:p>
       <w:pPr>
         <w:pStyle w:val="Heading1"/>
@@ -672,7 +672,7 @@
       <w:r>
         <w:t xml:space="preserve"> </w:t>
       </w:r>
-      <w:hyperlink r:id="rId41">
+      <w:hyperlink r:id="rId39">
         <w:r>
           <w:rPr>
             <w:rStyle w:val="Hyperlink"/>
@@ -695,7 +695,7 @@
         <w:t xml:space="preserve">The questions you must answer are written both in the Shiny app interface as well as in this handout. As you go, you should fill out your answers in this document.</w:t>
       </w:r>
     </w:p>
-    <w:bookmarkStart w:id="42" w:name="think-about-it"/>
+    <w:bookmarkStart w:id="40" w:name="think-about-it"/>
     <w:p>
       <w:pPr>
         <w:pStyle w:val="Heading2"/>
@@ -769,9 +769,9 @@
         <w:br/>
       </w:r>
     </w:p>
-    <w:bookmarkEnd w:id="42"/>
-    <w:bookmarkEnd w:id="43"/>
-    <w:bookmarkStart w:id="49" w:name="X1510ad7d81a234592f5012c6c993acb24f3f130"/>
+    <w:bookmarkEnd w:id="40"/>
+    <w:bookmarkEnd w:id="41"/>
+    <w:bookmarkStart w:id="47" w:name="X1510ad7d81a234592f5012c6c993acb24f3f130"/>
     <w:p>
       <w:pPr>
         <w:pStyle w:val="Heading1"/>
@@ -780,7 +780,7 @@
         <w:t xml:space="preserve">Activity A: Select an environmental case study, visualize data, and fit a model</w:t>
       </w:r>
     </w:p>
-    <w:bookmarkStart w:id="44" w:name="objective-1-select-case-study"/>
+    <w:bookmarkStart w:id="42" w:name="objective-1-select-case-study"/>
     <w:p>
       <w:pPr>
         <w:pStyle w:val="Heading2"/>
@@ -1026,8 +1026,8 @@
         <w:br/>
       </w:r>
     </w:p>
-    <w:bookmarkEnd w:id="44"/>
-    <w:bookmarkStart w:id="45" w:name="objective-2-explore-data"/>
+    <w:bookmarkEnd w:id="42"/>
+    <w:bookmarkStart w:id="43" w:name="objective-2-explore-data"/>
     <w:p>
       <w:pPr>
         <w:pStyle w:val="Heading2"/>
@@ -1930,8 +1930,8 @@
         <w:br/>
       </w:r>
     </w:p>
-    <w:bookmarkEnd w:id="45"/>
-    <w:bookmarkStart w:id="46" w:name="objective-3-learn-about-arima-model"/>
+    <w:bookmarkEnd w:id="43"/>
+    <w:bookmarkStart w:id="44" w:name="objective-3-learn-about-arima-model"/>
     <w:p>
       <w:pPr>
         <w:pStyle w:val="Heading2"/>
@@ -2039,14 +2039,13 @@
     </w:p>
     <w:p>
       <w:pPr>
-        <w:pStyle w:val="Compact"/>
         <w:numPr>
           <w:ilvl w:val="0"/>
           <w:numId w:val="1010"/>
         </w:numPr>
       </w:pPr>
       <w:r>
-        <w:t xml:space="preserve">Observe the PACF (partial autocorrelation function) plot on the right. Based on this figure, how many lags of the target variable do you anticipate being included in the fitted ARIMA model? Explain your reasoning.</w:t>
+        <w:t xml:space="preserve">Compare the R2 value between the one-day lag and the current value of your target variable with the R2 values you received when investigating relationships between environmental variables and the target variables in Objective 2, Q6. Which R2 value is the highest, and what does this mean about the relative importance of the one-day lag vs. environmental variables in predicting your target variable?</w:t>
       </w:r>
       <w:r>
         <w:br/>
@@ -2064,14 +2063,38 @@
     </w:p>
     <w:p>
       <w:pPr>
-        <w:pStyle w:val="FirstParagraph"/>
-      </w:pPr>
+        <w:numPr>
+          <w:ilvl w:val="0"/>
+          <w:numId w:val="1010"/>
+        </w:numPr>
+      </w:pPr>
+      <w:r>
+        <w:t xml:space="preserve">Observe the PACF (partial autocorrelation function) plot on the right. Based on this figure, how many lags of the target variable do you anticipate being included in the fitted ARIMA model? Explain your reasoning.</w:t>
+      </w:r>
+      <w:r>
+        <w:br/>
+      </w:r>
       <w:r>
         <w:rPr>
           <w:b/>
           <w:bCs/>
         </w:rPr>
-        <w:t xml:space="preserve">Please download the plot associated with Q9 and copy-paste it into your report below.</w:t>
+        <w:t xml:space="preserve">Answer:</w:t>
+      </w:r>
+      <w:r>
+        <w:br/>
+      </w:r>
+    </w:p>
+    <w:p>
+      <w:pPr>
+        <w:pStyle w:val="FirstParagraph"/>
+      </w:pPr>
+      <w:r>
+        <w:rPr>
+          <w:b/>
+          <w:bCs/>
+        </w:rPr>
+        <w:t xml:space="preserve">Please download the plot associated with Q10 and copy-paste it into your report below.</w:t>
       </w:r>
     </w:p>
     <w:p>
@@ -2120,7 +2143,7 @@
           <w:b/>
           <w:bCs/>
         </w:rPr>
-        <w:t xml:space="preserve">Please download the plot associated with Q10 and copy-paste it into your report below.</w:t>
+        <w:t xml:space="preserve">Please download the plot associated with Q11 and copy-paste it into your report below.</w:t>
       </w:r>
     </w:p>
     <w:p>
@@ -2135,8 +2158,8 @@
         <w:t xml:space="preserve">Figure 3. Differenced time series of environmental case study target variable</w:t>
       </w:r>
     </w:p>
-    <w:bookmarkEnd w:id="46"/>
-    <w:bookmarkStart w:id="47" w:name="objective-4-fit-model"/>
+    <w:bookmarkEnd w:id="44"/>
+    <w:bookmarkStart w:id="45" w:name="objective-4-fit-model"/>
     <w:p>
       <w:pPr>
         <w:pStyle w:val="Heading2"/>
@@ -2346,7 +2369,7 @@
         </w:numPr>
       </w:pPr>
       <w:r>
-        <w:t xml:space="preserve">Assess the importance of the exogenous regressors you chose to include in the model. Based on the term estimates and standard errors, were these variables important in your final, fitted model? Explain your reasoning.</w:t>
+        <w:t xml:space="preserve">If you included exogenous regressors, assess their importance in the model. Based on the term estimates and standard errors, were these variables important in your final, fitted model? Explain your reasoning. If you did not include exogenous regressors, please state this.</w:t>
       </w:r>
       <w:r>
         <w:br/>
@@ -2362,8 +2385,8 @@
         <w:br/>
       </w:r>
     </w:p>
-    <w:bookmarkEnd w:id="47"/>
-    <w:bookmarkStart w:id="48" w:name="objective-5-assess-model-fit"/>
+    <w:bookmarkEnd w:id="45"/>
+    <w:bookmarkStart w:id="46" w:name="objective-5-assess-model-fit"/>
     <w:p>
       <w:pPr>
         <w:pStyle w:val="Heading2"/>
@@ -2431,7 +2454,7 @@
           <w:b/>
           <w:bCs/>
         </w:rPr>
-        <w:t xml:space="preserve">Please download the plot associated with Q16 and copy-paste it into your report below.</w:t>
+        <w:t xml:space="preserve">Please download the plot associated with Q17 and copy-paste it into your report below.</w:t>
       </w:r>
     </w:p>
     <w:p>
@@ -2527,7 +2550,7 @@
           <w:b/>
           <w:bCs/>
         </w:rPr>
-        <w:t xml:space="preserve">Please download the plot associated with Q19 and copy-paste it into your report below.</w:t>
+        <w:t xml:space="preserve">Please download the plot associated with Q20 and copy-paste it into your report below.</w:t>
       </w:r>
     </w:p>
     <w:p>
@@ -2544,14 +2567,13 @@
     </w:p>
     <w:p>
       <w:pPr>
-        <w:pStyle w:val="Compact"/>
         <w:numPr>
           <w:ilvl w:val="0"/>
           <w:numId w:val="1015"/>
         </w:numPr>
       </w:pPr>
       <w:r>
-        <w:t xml:space="preserve">Compare your answers to Q16 and Q19. Were there any differences in your interpretation of model fit when you visualized predictions with and without uncertainty? Why do you think this might be?</w:t>
+        <w:t xml:space="preserve">Compare your answers to Q17 and Q20. Were there any differences in your interpretation of model fit when you visualized predictions with and without uncertainty? Why do you think this might be?</w:t>
       </w:r>
       <w:r>
         <w:br/>
@@ -2568,67 +2590,14 @@
       </w:r>
     </w:p>
     <w:p>
-      <w:r>
-        <w:br w:type="page"/>
-      </w:r>
-    </w:p>
-    <w:bookmarkEnd w:id="48"/>
-    <w:bookmarkEnd w:id="49"/>
-    <w:bookmarkStart w:id="53" w:name="X2a312434f3d95cecd141fd168999c68d9c7f539"/>
-    <w:p>
-      <w:pPr>
-        <w:pStyle w:val="Heading1"/>
-      </w:pPr>
-      <w:r>
-        <w:t xml:space="preserve">Activity B: Upload your own data and fit a time series model</w:t>
-      </w:r>
-    </w:p>
-    <w:bookmarkStart w:id="50" w:name="objective-6-upload-standardized-data"/>
-    <w:p>
-      <w:pPr>
-        <w:pStyle w:val="Heading2"/>
-      </w:pPr>
-      <w:r>
-        <w:t xml:space="preserve">Objective 6: Upload standardized data</w:t>
-      </w:r>
-      <w:r>
-        <w:br/>
-      </w:r>
-    </w:p>
-    <w:p>
-      <w:r>
-        <w:pict>
-          <v:rect style="width:0;height:1.5pt" o:hralign="center" o:hrstd="t" o:hr="t"/>
-        </w:pict>
-      </w:r>
-    </w:p>
-    <w:p>
-      <w:pPr>
-        <w:pStyle w:val="FirstParagraph"/>
-      </w:pPr>
-      <w:r>
-        <w:t xml:space="preserve">In this objective, you will learn about the importance of data standards for reproducible scientific analyses, as well as wrangle and upload a new environmental dataset of your choosing.</w:t>
-      </w:r>
-    </w:p>
-    <w:p>
-      <w:r>
-        <w:pict>
-          <v:rect style="width:0;height:1.5pt" o:hralign="center" o:hrstd="t" o:hr="t"/>
-        </w:pict>
-      </w:r>
-    </w:p>
-    <w:p>
       <w:pPr>
         <w:numPr>
           <w:ilvl w:val="0"/>
-          <w:numId w:val="1016"/>
+          <w:numId w:val="1015"/>
         </w:numPr>
       </w:pPr>
       <w:r>
-        <w:t xml:space="preserve">Describe one example of a benefit of using data standards in ecology and environmental science, as well as one example of a risk if data standards are not followed.</w:t>
-      </w:r>
-      <w:r>
-        <w:br/>
+        <w:t xml:space="preserve">Briefly define (a) RMSE and (b) ignorance score in your own words.</w:t>
       </w:r>
       <w:r>
         <w:br/>
@@ -2648,14 +2617,23 @@
       <w:pPr>
         <w:numPr>
           <w:ilvl w:val="0"/>
-          <w:numId w:val="1016"/>
+          <w:numId w:val="1015"/>
         </w:numPr>
       </w:pPr>
       <w:r>
-        <w:t xml:space="preserve">Is the standardized data format for this module a long or a wide format? Explain how you know.</w:t>
-      </w:r>
-      <w:r>
-        <w:br/>
+        <w:t xml:space="preserve">Click</w:t>
+      </w:r>
+      <w:r>
+        <w:t xml:space="preserve"> </w:t>
+      </w:r>
+      <w:r>
+        <w:t xml:space="preserve">“Assess model”</w:t>
+      </w:r>
+      <w:r>
+        <w:t xml:space="preserve"> </w:t>
+      </w:r>
+      <w:r>
+        <w:t xml:space="preserve">and record the value of the RMSE and ignorance score for your fitted ARIMA model.</w:t>
       </w:r>
       <w:r>
         <w:br/>
@@ -2675,6 +2653,134 @@
       <w:pPr>
         <w:numPr>
           <w:ilvl w:val="0"/>
+          <w:numId w:val="1015"/>
+        </w:numPr>
+      </w:pPr>
+      <w:r>
+        <w:t xml:space="preserve">Compare the RMSE and ignorance score for your model to your partner’s model. Whose model scored better? Explain your reasoning.</w:t>
+      </w:r>
+      <w:r>
+        <w:br/>
+      </w:r>
+      <w:r>
+        <w:rPr>
+          <w:b/>
+          <w:bCs/>
+        </w:rPr>
+        <w:t xml:space="preserve">Answer:</w:t>
+      </w:r>
+      <w:r>
+        <w:br/>
+      </w:r>
+    </w:p>
+    <w:p>
+      <w:r>
+        <w:br w:type="page"/>
+      </w:r>
+    </w:p>
+    <w:bookmarkEnd w:id="46"/>
+    <w:bookmarkEnd w:id="47"/>
+    <w:bookmarkStart w:id="51" w:name="X2a312434f3d95cecd141fd168999c68d9c7f539"/>
+    <w:p>
+      <w:pPr>
+        <w:pStyle w:val="Heading1"/>
+      </w:pPr>
+      <w:r>
+        <w:t xml:space="preserve">Activity B: Upload your own data and fit a time series model</w:t>
+      </w:r>
+    </w:p>
+    <w:bookmarkStart w:id="48" w:name="objective-6-upload-standardized-data"/>
+    <w:p>
+      <w:pPr>
+        <w:pStyle w:val="Heading2"/>
+      </w:pPr>
+      <w:r>
+        <w:t xml:space="preserve">Objective 6: Upload standardized data</w:t>
+      </w:r>
+      <w:r>
+        <w:br/>
+      </w:r>
+    </w:p>
+    <w:p>
+      <w:r>
+        <w:pict>
+          <v:rect style="width:0;height:1.5pt" o:hralign="center" o:hrstd="t" o:hr="t"/>
+        </w:pict>
+      </w:r>
+    </w:p>
+    <w:p>
+      <w:pPr>
+        <w:pStyle w:val="FirstParagraph"/>
+      </w:pPr>
+      <w:r>
+        <w:t xml:space="preserve">In this objective, you will learn about the importance of data standards for reproducible scientific analyses, as well as wrangle and upload a new environmental dataset of your choosing.</w:t>
+      </w:r>
+    </w:p>
+    <w:p>
+      <w:r>
+        <w:pict>
+          <v:rect style="width:0;height:1.5pt" o:hralign="center" o:hrstd="t" o:hr="t"/>
+        </w:pict>
+      </w:r>
+    </w:p>
+    <w:p>
+      <w:pPr>
+        <w:numPr>
+          <w:ilvl w:val="0"/>
+          <w:numId w:val="1016"/>
+        </w:numPr>
+      </w:pPr>
+      <w:r>
+        <w:t xml:space="preserve">Describe one example of a benefit of using data standards in ecology and environmental science, as well as one example of a risk if data standards are not followed.</w:t>
+      </w:r>
+      <w:r>
+        <w:br/>
+      </w:r>
+      <w:r>
+        <w:br/>
+      </w:r>
+      <w:r>
+        <w:rPr>
+          <w:b/>
+          <w:bCs/>
+        </w:rPr>
+        <w:t xml:space="preserve">Answer:</w:t>
+      </w:r>
+      <w:r>
+        <w:br/>
+      </w:r>
+    </w:p>
+    <w:p>
+      <w:pPr>
+        <w:numPr>
+          <w:ilvl w:val="0"/>
+          <w:numId w:val="1016"/>
+        </w:numPr>
+      </w:pPr>
+      <w:r>
+        <w:t xml:space="preserve">Is the standardized data format for this module a long or a wide format? Explain how you know.</w:t>
+      </w:r>
+      <w:r>
+        <w:br/>
+      </w:r>
+      <w:r>
+        <w:br/>
+      </w:r>
+      <w:r>
+        <w:rPr>
+          <w:b/>
+          <w:bCs/>
+        </w:rPr>
+        <w:t xml:space="preserve">Answer:</w:t>
+      </w:r>
+      <w:r>
+        <w:br/>
+      </w:r>
+    </w:p>
+    <w:p>
+      <w:pPr>
+        <w:numPr>
+          <w:ilvl w:val="0"/>
           <w:numId w:val="1016"/>
         </w:numPr>
       </w:pPr>
@@ -2842,8 +2948,8 @@
         <w:br/>
       </w:r>
     </w:p>
-    <w:bookmarkEnd w:id="50"/>
-    <w:bookmarkStart w:id="51" w:name="Xdb3ccaed68c35206ff15f0b9361ed97e273aaea"/>
+    <w:bookmarkEnd w:id="48"/>
+    <w:bookmarkStart w:id="49" w:name="Xdb3ccaed68c35206ff15f0b9361ed97e273aaea"/>
     <w:p>
       <w:pPr>
         <w:pStyle w:val="Heading2"/>
@@ -3126,8 +3232,8 @@
         <w:br/>
       </w:r>
     </w:p>
-    <w:bookmarkEnd w:id="51"/>
-    <w:bookmarkStart w:id="52" w:name="objective-8-assess-model-fit"/>
+    <w:bookmarkEnd w:id="49"/>
+    <w:bookmarkStart w:id="50" w:name="objective-8-assess-model-fit"/>
     <w:p>
       <w:pPr>
         <w:pStyle w:val="Heading2"/>
@@ -3170,7 +3276,7 @@
         </w:numPr>
       </w:pPr>
       <w:r>
-        <w:t xml:space="preserve">Inspect the plot on the right. How well do you think the model predictions fit the observations in the test dataset? Explain your reasoning.</w:t>
+        <w:t xml:space="preserve">Inspect the plot above. How well do you think the model predictions with uncertainty fit the observations in the test dataset? Explain your reasoning.</w:t>
       </w:r>
       <w:r>
         <w:br/>
@@ -3198,7 +3304,7 @@
           <w:b/>
           <w:bCs/>
         </w:rPr>
-        <w:t xml:space="preserve">Please download the plot associated with Q32 and copy-paste it into your report below.</w:t>
+        <w:t xml:space="preserve">Please download the plot associated with Q33 and copy-paste it into your report below.</w:t>
       </w:r>
     </w:p>
     <w:p>
@@ -3246,9 +3352,9 @@
         <w:br w:type="page"/>
       </w:r>
     </w:p>
-    <w:bookmarkEnd w:id="52"/>
-    <w:bookmarkEnd w:id="53"/>
-    <w:bookmarkStart w:id="57" w:name="Xd8e9adcf9c0b99f2d35ba6dfa925093f5ad976d"/>
+    <w:bookmarkEnd w:id="50"/>
+    <w:bookmarkEnd w:id="51"/>
+    <w:bookmarkStart w:id="55" w:name="Xd8e9adcf9c0b99f2d35ba6dfa925093f5ad976d"/>
     <w:p>
       <w:pPr>
         <w:pStyle w:val="Heading1"/>
@@ -3257,7 +3363,7 @@
         <w:t xml:space="preserve">Activity C: Compare predictive performance across models</w:t>
       </w:r>
     </w:p>
-    <w:bookmarkStart w:id="54" w:name="objective-9-fit-additional-models"/>
+    <w:bookmarkStart w:id="52" w:name="objective-9-fit-additional-models"/>
     <w:p>
       <w:pPr>
         <w:pStyle w:val="Heading2"/>
@@ -3503,7 +3609,7 @@
           <w:b/>
           <w:bCs/>
         </w:rPr>
-        <w:t xml:space="preserve">Please download the plot associated with Q37 and copy-paste it into your report below.</w:t>
+        <w:t xml:space="preserve">Please download the plot associated with Q38 and copy-paste it into your report below.</w:t>
       </w:r>
     </w:p>
     <w:p>
@@ -3518,8 +3624,8 @@
         <w:t xml:space="preserve">Figure 7. ARIMA, NNETAR, persistence, and DOY model fits for the standardized dataset target variable</w:t>
       </w:r>
     </w:p>
-    <w:bookmarkEnd w:id="54"/>
-    <w:bookmarkStart w:id="56" w:name="objective-10-compare-model-performance"/>
+    <w:bookmarkEnd w:id="52"/>
+    <w:bookmarkStart w:id="54" w:name="objective-10-compare-model-performance"/>
     <w:p>
       <w:pPr>
         <w:pStyle w:val="Heading2"/>
@@ -3590,7 +3696,7 @@
           <w:b/>
           <w:bCs/>
         </w:rPr>
-        <w:t xml:space="preserve">Please download the plot associated with Q38 and copy-paste it into your report below.</w:t>
+        <w:t xml:space="preserve">Please download the plot associated with Q39 and copy-paste it into your report below.</w:t>
       </w:r>
     </w:p>
     <w:p>
@@ -3640,7 +3746,7 @@
         </w:numPr>
       </w:pPr>
       <w:r>
-        <w:t xml:space="preserve">Which of the models has the largest predictive uncertainty interval? Does this match what you predicted in Q39?</w:t>
+        <w:t xml:space="preserve">Which of the models has the largest predictive uncertainty interval? Does this match what you predicted in Q40?</w:t>
       </w:r>
       <w:r>
         <w:br/>
@@ -3668,7 +3774,7 @@
           <w:b/>
           <w:bCs/>
         </w:rPr>
-        <w:t xml:space="preserve">Please download the plot associated with Q40 and copy-paste it into your report below.</w:t>
+        <w:t xml:space="preserve">Please download the plot associated with Q41 and copy-paste it into your report below.</w:t>
       </w:r>
     </w:p>
     <w:p>
@@ -3977,7 +4083,7 @@
         </w:numPr>
       </w:pPr>
       <w:r>
-        <w:t xml:space="preserve">Did the more complex models (ARIMA, NNETAR) perform better than the historical mean and/or DOY models? What does this result indicate about the importance of exogenous regressors for predicting the target variable in your chosen dataset?</w:t>
+        <w:t xml:space="preserve">Did the more complex models (ARIMA, NNETAR) perform better than the historical mean and/or DOY models? What does this result indicate about the importance of using more complex models (and exogenous regressors if you chose to include them) for predicting the target variable in your chosen dataset?</w:t>
       </w:r>
       <w:r>
         <w:br/>
@@ -4006,7 +4112,7 @@
       <w:r>
         <w:t xml:space="preserve"> </w:t>
       </w:r>
-      <w:hyperlink r:id="rId55">
+      <w:hyperlink r:id="rId53">
         <w:r>
           <w:rPr>
             <w:rStyle w:val="Hyperlink"/>
@@ -4023,14 +4129,14 @@
         <w:pStyle w:val="BodyText"/>
       </w:pPr>
       <w:r>
-        <w:t xml:space="preserve">This document last modified: 11 August 2025 by MEL.</w:t>
-      </w:r>
-    </w:p>
-    <w:bookmarkEnd w:id="56"/>
-    <w:bookmarkEnd w:id="57"/>
+        <w:t xml:space="preserve">This document last modified: 24 February 2026 by MEL.</w:t>
+      </w:r>
+    </w:p>
+    <w:bookmarkEnd w:id="54"/>
+    <w:bookmarkEnd w:id="55"/>
     <w:sectPr>
-      <w:footerReference r:id="rId9" w:type="even"/>
-      <w:footerReference r:id="rId10" w:type="default"/>
+      <w:footerReference r:id="rId8" w:type="even"/>
+      <w:footerReference r:id="rId9" w:type="default"/>
       <w:pgSz w:h="15840" w:w="12240"/>
       <w:pgMar w:bottom="1440" w:footer="720" w:gutter="0" w:header="720" w:left="1440" w:right="1440" w:top="1440"/>
       <w:cols w:space="720"/>
@@ -5250,91 +5356,6 @@
       </w:pPr>
     </w:lvl>
   </w:abstractNum>
-  <w:abstractNum w:abstractNumId="994110">
-    <w:nsid w:val="0A994110"/>
-    <w:multiLevelType w:val="multilevel"/>
-    <w:lvl w:ilvl="0">
-      <w:start w:val="10"/>
-      <w:numFmt w:val="decimal"/>
-      <w:lvlText w:val="%1."/>
-      <w:lvlJc w:val="left"/>
-      <w:pPr>
-        <w:ind w:left="720" w:hanging="360"/>
-      </w:pPr>
-    </w:lvl>
-    <w:lvl w:ilvl="1">
-      <w:start w:val="10"/>
-      <w:numFmt w:val="decimal"/>
-      <w:lvlText w:val="%2."/>
-      <w:lvlJc w:val="left"/>
-      <w:pPr>
-        <w:ind w:left="1440" w:hanging="360"/>
-      </w:pPr>
-    </w:lvl>
-    <w:lvl w:ilvl="2">
-      <w:start w:val="10"/>
-      <w:numFmt w:val="decimal"/>
-      <w:lvlText w:val="%3."/>
-      <w:lvlJc w:val="left"/>
-      <w:pPr>
-        <w:ind w:left="2160" w:hanging="360"/>
-      </w:pPr>
-    </w:lvl>
-    <w:lvl w:ilvl="3">
-      <w:start w:val="10"/>
-      <w:numFmt w:val="decimal"/>
-      <w:lvlText w:val="%4."/>
-      <w:lvlJc w:val="left"/>
-      <w:pPr>
-        <w:ind w:left="2880" w:hanging="360"/>
-      </w:pPr>
-    </w:lvl>
-    <w:lvl w:ilvl="4">
-      <w:start w:val="10"/>
-      <w:numFmt w:val="decimal"/>
-      <w:lvlText w:val="%5."/>
-      <w:lvlJc w:val="left"/>
-      <w:pPr>
-        <w:ind w:left="3600" w:hanging="360"/>
-      </w:pPr>
-    </w:lvl>
-    <w:lvl w:ilvl="5">
-      <w:start w:val="10"/>
-      <w:numFmt w:val="decimal"/>
-      <w:lvlText w:val="%6."/>
-      <w:lvlJc w:val="left"/>
-      <w:pPr>
-        <w:ind w:left="4320" w:hanging="360"/>
-      </w:pPr>
-    </w:lvl>
-    <w:lvl w:ilvl="6">
-      <w:start w:val="10"/>
-      <w:numFmt w:val="decimal"/>
-      <w:lvlText w:val="%7."/>
-      <w:lvlJc w:val="left"/>
-      <w:pPr>
-        <w:ind w:left="5040" w:hanging="360"/>
-      </w:pPr>
-    </w:lvl>
-    <w:lvl w:ilvl="7">
-      <w:start w:val="10"/>
-      <w:numFmt w:val="decimal"/>
-      <w:lvlText w:val="%8."/>
-      <w:lvlJc w:val="left"/>
-      <w:pPr>
-        <w:ind w:left="5760" w:hanging="360"/>
-      </w:pPr>
-    </w:lvl>
-    <w:lvl w:ilvl="8">
-      <w:start w:val="10"/>
-      <w:numFmt w:val="decimal"/>
-      <w:lvlText w:val="%9."/>
-      <w:lvlJc w:val="left"/>
-      <w:pPr>
-        <w:ind w:left="6480" w:hanging="360"/>
-      </w:pPr>
-    </w:lvl>
-  </w:abstractNum>
   <w:abstractNum w:abstractNumId="994111">
     <w:nsid w:val="0A994111"/>
     <w:multiLevelType w:val="multilevel"/>
@@ -5420,11 +5441,11 @@
       </w:pPr>
     </w:lvl>
   </w:abstractNum>
-  <w:abstractNum w:abstractNumId="994116">
-    <w:nsid w:val="0A994116"/>
+  <w:abstractNum w:abstractNumId="994112">
+    <w:nsid w:val="0A994112"/>
     <w:multiLevelType w:val="multilevel"/>
     <w:lvl w:ilvl="0">
-      <w:start w:val="16"/>
+      <w:start w:val="12"/>
       <w:numFmt w:val="decimal"/>
       <w:lvlText w:val="%1."/>
       <w:lvlJc w:val="left"/>
@@ -5433,7 +5454,7 @@
       </w:pPr>
     </w:lvl>
     <w:lvl w:ilvl="1">
-      <w:start w:val="16"/>
+      <w:start w:val="12"/>
       <w:numFmt w:val="decimal"/>
       <w:lvlText w:val="%2."/>
       <w:lvlJc w:val="left"/>
@@ -5442,7 +5463,7 @@
       </w:pPr>
     </w:lvl>
     <w:lvl w:ilvl="2">
-      <w:start w:val="16"/>
+      <w:start w:val="12"/>
       <w:numFmt w:val="decimal"/>
       <w:lvlText w:val="%3."/>
       <w:lvlJc w:val="left"/>
@@ -5451,7 +5472,7 @@
       </w:pPr>
     </w:lvl>
     <w:lvl w:ilvl="3">
-      <w:start w:val="16"/>
+      <w:start w:val="12"/>
       <w:numFmt w:val="decimal"/>
       <w:lvlText w:val="%4."/>
       <w:lvlJc w:val="left"/>
@@ -5460,7 +5481,7 @@
       </w:pPr>
     </w:lvl>
     <w:lvl w:ilvl="4">
-      <w:start w:val="16"/>
+      <w:start w:val="12"/>
       <w:numFmt w:val="decimal"/>
       <w:lvlText w:val="%5."/>
       <w:lvlJc w:val="left"/>
@@ -5469,7 +5490,7 @@
       </w:pPr>
     </w:lvl>
     <w:lvl w:ilvl="5">
-      <w:start w:val="16"/>
+      <w:start w:val="12"/>
       <w:numFmt w:val="decimal"/>
       <w:lvlText w:val="%6."/>
       <w:lvlJc w:val="left"/>
@@ -5478,7 +5499,7 @@
       </w:pPr>
     </w:lvl>
     <w:lvl w:ilvl="6">
-      <w:start w:val="16"/>
+      <w:start w:val="12"/>
       <w:numFmt w:val="decimal"/>
       <w:lvlText w:val="%7."/>
       <w:lvlJc w:val="left"/>
@@ -5487,7 +5508,7 @@
       </w:pPr>
     </w:lvl>
     <w:lvl w:ilvl="7">
-      <w:start w:val="16"/>
+      <w:start w:val="12"/>
       <w:numFmt w:val="decimal"/>
       <w:lvlText w:val="%8."/>
       <w:lvlJc w:val="left"/>
@@ -5496,7 +5517,7 @@
       </w:pPr>
     </w:lvl>
     <w:lvl w:ilvl="8">
-      <w:start w:val="16"/>
+      <w:start w:val="12"/>
       <w:numFmt w:val="decimal"/>
       <w:lvlText w:val="%9."/>
       <w:lvlJc w:val="left"/>
@@ -5590,11 +5611,11 @@
       </w:pPr>
     </w:lvl>
   </w:abstractNum>
-  <w:abstractNum w:abstractNumId="994120">
-    <w:nsid w:val="0A994120"/>
+  <w:abstractNum w:abstractNumId="994118">
+    <w:nsid w:val="0A994118"/>
     <w:multiLevelType w:val="multilevel"/>
     <w:lvl w:ilvl="0">
-      <w:start w:val="20"/>
+      <w:start w:val="18"/>
       <w:numFmt w:val="decimal"/>
       <w:lvlText w:val="%1."/>
       <w:lvlJc w:val="left"/>
@@ -5603,7 +5624,7 @@
       </w:pPr>
     </w:lvl>
     <w:lvl w:ilvl="1">
-      <w:start w:val="20"/>
+      <w:start w:val="18"/>
       <w:numFmt w:val="decimal"/>
       <w:lvlText w:val="%2."/>
       <w:lvlJc w:val="left"/>
@@ -5612,7 +5633,7 @@
       </w:pPr>
     </w:lvl>
     <w:lvl w:ilvl="2">
-      <w:start w:val="20"/>
+      <w:start w:val="18"/>
       <w:numFmt w:val="decimal"/>
       <w:lvlText w:val="%3."/>
       <w:lvlJc w:val="left"/>
@@ -5621,7 +5642,7 @@
       </w:pPr>
     </w:lvl>
     <w:lvl w:ilvl="3">
-      <w:start w:val="20"/>
+      <w:start w:val="18"/>
       <w:numFmt w:val="decimal"/>
       <w:lvlText w:val="%4."/>
       <w:lvlJc w:val="left"/>
@@ -5630,7 +5651,7 @@
       </w:pPr>
     </w:lvl>
     <w:lvl w:ilvl="4">
-      <w:start w:val="20"/>
+      <w:start w:val="18"/>
       <w:numFmt w:val="decimal"/>
       <w:lvlText w:val="%5."/>
       <w:lvlJc w:val="left"/>
@@ -5639,7 +5660,7 @@
       </w:pPr>
     </w:lvl>
     <w:lvl w:ilvl="5">
-      <w:start w:val="20"/>
+      <w:start w:val="18"/>
       <w:numFmt w:val="decimal"/>
       <w:lvlText w:val="%6."/>
       <w:lvlJc w:val="left"/>
@@ -5648,7 +5669,7 @@
       </w:pPr>
     </w:lvl>
     <w:lvl w:ilvl="6">
-      <w:start w:val="20"/>
+      <w:start w:val="18"/>
       <w:numFmt w:val="decimal"/>
       <w:lvlText w:val="%7."/>
       <w:lvlJc w:val="left"/>
@@ -5657,7 +5678,7 @@
       </w:pPr>
     </w:lvl>
     <w:lvl w:ilvl="7">
-      <w:start w:val="20"/>
+      <w:start w:val="18"/>
       <w:numFmt w:val="decimal"/>
       <w:lvlText w:val="%8."/>
       <w:lvlJc w:val="left"/>
@@ -5666,7 +5687,7 @@
       </w:pPr>
     </w:lvl>
     <w:lvl w:ilvl="8">
-      <w:start w:val="20"/>
+      <w:start w:val="18"/>
       <w:numFmt w:val="decimal"/>
       <w:lvlText w:val="%9."/>
       <w:lvlJc w:val="left"/>
@@ -5675,11 +5696,11 @@
       </w:pPr>
     </w:lvl>
   </w:abstractNum>
-  <w:abstractNum w:abstractNumId="994124">
-    <w:nsid w:val="0A994124"/>
+  <w:abstractNum w:abstractNumId="994121">
+    <w:nsid w:val="0A994121"/>
     <w:multiLevelType w:val="multilevel"/>
     <w:lvl w:ilvl="0">
-      <w:start w:val="24"/>
+      <w:start w:val="21"/>
       <w:numFmt w:val="decimal"/>
       <w:lvlText w:val="%1."/>
       <w:lvlJc w:val="left"/>
@@ -5688,7 +5709,7 @@
       </w:pPr>
     </w:lvl>
     <w:lvl w:ilvl="1">
-      <w:start w:val="24"/>
+      <w:start w:val="21"/>
       <w:numFmt w:val="decimal"/>
       <w:lvlText w:val="%2."/>
       <w:lvlJc w:val="left"/>
@@ -5697,7 +5718,7 @@
       </w:pPr>
     </w:lvl>
     <w:lvl w:ilvl="2">
-      <w:start w:val="24"/>
+      <w:start w:val="21"/>
       <w:numFmt w:val="decimal"/>
       <w:lvlText w:val="%3."/>
       <w:lvlJc w:val="left"/>
@@ -5706,7 +5727,7 @@
       </w:pPr>
     </w:lvl>
     <w:lvl w:ilvl="3">
-      <w:start w:val="24"/>
+      <w:start w:val="21"/>
       <w:numFmt w:val="decimal"/>
       <w:lvlText w:val="%4."/>
       <w:lvlJc w:val="left"/>
@@ -5715,7 +5736,7 @@
       </w:pPr>
     </w:lvl>
     <w:lvl w:ilvl="4">
-      <w:start w:val="24"/>
+      <w:start w:val="21"/>
       <w:numFmt w:val="decimal"/>
       <w:lvlText w:val="%5."/>
       <w:lvlJc w:val="left"/>
@@ -5724,7 +5745,7 @@
       </w:pPr>
     </w:lvl>
     <w:lvl w:ilvl="5">
-      <w:start w:val="24"/>
+      <w:start w:val="21"/>
       <w:numFmt w:val="decimal"/>
       <w:lvlText w:val="%6."/>
       <w:lvlJc w:val="left"/>
@@ -5733,7 +5754,7 @@
       </w:pPr>
     </w:lvl>
     <w:lvl w:ilvl="6">
-      <w:start w:val="24"/>
+      <w:start w:val="21"/>
       <w:numFmt w:val="decimal"/>
       <w:lvlText w:val="%7."/>
       <w:lvlJc w:val="left"/>
@@ -5742,7 +5763,7 @@
       </w:pPr>
     </w:lvl>
     <w:lvl w:ilvl="7">
-      <w:start w:val="24"/>
+      <w:start w:val="21"/>
       <w:numFmt w:val="decimal"/>
       <w:lvlText w:val="%8."/>
       <w:lvlJc w:val="left"/>
@@ -5751,7 +5772,92 @@
       </w:pPr>
     </w:lvl>
     <w:lvl w:ilvl="8">
-      <w:start w:val="24"/>
+      <w:start w:val="21"/>
+      <w:numFmt w:val="decimal"/>
+      <w:lvlText w:val="%9."/>
+      <w:lvlJc w:val="left"/>
+      <w:pPr>
+        <w:ind w:left="6480" w:hanging="360"/>
+      </w:pPr>
+    </w:lvl>
+  </w:abstractNum>
+  <w:abstractNum w:abstractNumId="994125">
+    <w:nsid w:val="0A994125"/>
+    <w:multiLevelType w:val="multilevel"/>
+    <w:lvl w:ilvl="0">
+      <w:start w:val="25"/>
+      <w:numFmt w:val="decimal"/>
+      <w:lvlText w:val="%1."/>
+      <w:lvlJc w:val="left"/>
+      <w:pPr>
+        <w:ind w:left="720" w:hanging="360"/>
+      </w:pPr>
+    </w:lvl>
+    <w:lvl w:ilvl="1">
+      <w:start w:val="25"/>
+      <w:numFmt w:val="decimal"/>
+      <w:lvlText w:val="%2."/>
+      <w:lvlJc w:val="left"/>
+      <w:pPr>
+        <w:ind w:left="1440" w:hanging="360"/>
+      </w:pPr>
+    </w:lvl>
+    <w:lvl w:ilvl="2">
+      <w:start w:val="25"/>
+      <w:numFmt w:val="decimal"/>
+      <w:lvlText w:val="%3."/>
+      <w:lvlJc w:val="left"/>
+      <w:pPr>
+        <w:ind w:left="2160" w:hanging="360"/>
+      </w:pPr>
+    </w:lvl>
+    <w:lvl w:ilvl="3">
+      <w:start w:val="25"/>
+      <w:numFmt w:val="decimal"/>
+      <w:lvlText w:val="%4."/>
+      <w:lvlJc w:val="left"/>
+      <w:pPr>
+        <w:ind w:left="2880" w:hanging="360"/>
+      </w:pPr>
+    </w:lvl>
+    <w:lvl w:ilvl="4">
+      <w:start w:val="25"/>
+      <w:numFmt w:val="decimal"/>
+      <w:lvlText w:val="%5."/>
+      <w:lvlJc w:val="left"/>
+      <w:pPr>
+        <w:ind w:left="3600" w:hanging="360"/>
+      </w:pPr>
+    </w:lvl>
+    <w:lvl w:ilvl="5">
+      <w:start w:val="25"/>
+      <w:numFmt w:val="decimal"/>
+      <w:lvlText w:val="%6."/>
+      <w:lvlJc w:val="left"/>
+      <w:pPr>
+        <w:ind w:left="4320" w:hanging="360"/>
+      </w:pPr>
+    </w:lvl>
+    <w:lvl w:ilvl="6">
+      <w:start w:val="25"/>
+      <w:numFmt w:val="decimal"/>
+      <w:lvlText w:val="%7."/>
+      <w:lvlJc w:val="left"/>
+      <w:pPr>
+        <w:ind w:left="5040" w:hanging="360"/>
+      </w:pPr>
+    </w:lvl>
+    <w:lvl w:ilvl="7">
+      <w:start w:val="25"/>
+      <w:numFmt w:val="decimal"/>
+      <w:lvlText w:val="%8."/>
+      <w:lvlJc w:val="left"/>
+      <w:pPr>
+        <w:ind w:left="5760" w:hanging="360"/>
+      </w:pPr>
+    </w:lvl>
+    <w:lvl w:ilvl="8">
+      <w:start w:val="25"/>
       <w:numFmt w:val="decimal"/>
       <w:lvlText w:val="%9."/>
       <w:lvlJc w:val="left"/>
@@ -5845,11 +5951,11 @@
       </w:pPr>
     </w:lvl>
   </w:abstractNum>
-  <w:abstractNum w:abstractNumId="994127">
-    <w:nsid w:val="0A994127"/>
+  <w:abstractNum w:abstractNumId="994128">
+    <w:nsid w:val="0A994128"/>
     <w:multiLevelType w:val="multilevel"/>
     <w:lvl w:ilvl="0">
-      <w:start w:val="27"/>
+      <w:start w:val="28"/>
       <w:numFmt w:val="decimal"/>
       <w:lvlText w:val="%1."/>
       <w:lvlJc w:val="left"/>
@@ -5858,7 +5964,7 @@
       </w:pPr>
     </w:lvl>
     <w:lvl w:ilvl="1">
-      <w:start w:val="27"/>
+      <w:start w:val="28"/>
       <w:numFmt w:val="decimal"/>
       <w:lvlText w:val="%2."/>
       <w:lvlJc w:val="left"/>
@@ -5867,7 +5973,7 @@
       </w:pPr>
     </w:lvl>
     <w:lvl w:ilvl="2">
-      <w:start w:val="27"/>
+      <w:start w:val="28"/>
       <w:numFmt w:val="decimal"/>
       <w:lvlText w:val="%3."/>
       <w:lvlJc w:val="left"/>
@@ -5876,7 +5982,7 @@
       </w:pPr>
     </w:lvl>
     <w:lvl w:ilvl="3">
-      <w:start w:val="27"/>
+      <w:start w:val="28"/>
       <w:numFmt w:val="decimal"/>
       <w:lvlText w:val="%4."/>
       <w:lvlJc w:val="left"/>
@@ -5885,7 +5991,7 @@
       </w:pPr>
     </w:lvl>
     <w:lvl w:ilvl="4">
-      <w:start w:val="27"/>
+      <w:start w:val="28"/>
       <w:numFmt w:val="decimal"/>
       <w:lvlText w:val="%5."/>
       <w:lvlJc w:val="left"/>
@@ -5894,7 +6000,7 @@
       </w:pPr>
     </w:lvl>
     <w:lvl w:ilvl="5">
-      <w:start w:val="27"/>
+      <w:start w:val="28"/>
       <w:numFmt w:val="decimal"/>
       <w:lvlText w:val="%6."/>
       <w:lvlJc w:val="left"/>
@@ -5903,7 +6009,7 @@
       </w:pPr>
     </w:lvl>
     <w:lvl w:ilvl="6">
-      <w:start w:val="27"/>
+      <w:start w:val="28"/>
       <w:numFmt w:val="decimal"/>
       <w:lvlText w:val="%7."/>
       <w:lvlJc w:val="left"/>
@@ -5912,7 +6018,7 @@
       </w:pPr>
     </w:lvl>
     <w:lvl w:ilvl="7">
-      <w:start w:val="27"/>
+      <w:start w:val="28"/>
       <w:numFmt w:val="decimal"/>
       <w:lvlText w:val="%8."/>
       <w:lvlJc w:val="left"/>
@@ -5921,92 +6027,7 @@
       </w:pPr>
     </w:lvl>
     <w:lvl w:ilvl="8">
-      <w:start w:val="27"/>
-      <w:numFmt w:val="decimal"/>
-      <w:lvlText w:val="%9."/>
-      <w:lvlJc w:val="left"/>
-      <w:pPr>
-        <w:ind w:left="6480" w:hanging="360"/>
-      </w:pPr>
-    </w:lvl>
-  </w:abstractNum>
-  <w:abstractNum w:abstractNumId="994132">
-    <w:nsid w:val="0A994132"/>
-    <w:multiLevelType w:val="multilevel"/>
-    <w:lvl w:ilvl="0">
-      <w:start w:val="32"/>
-      <w:numFmt w:val="decimal"/>
-      <w:lvlText w:val="%1."/>
-      <w:lvlJc w:val="left"/>
-      <w:pPr>
-        <w:ind w:left="720" w:hanging="360"/>
-      </w:pPr>
-    </w:lvl>
-    <w:lvl w:ilvl="1">
-      <w:start w:val="32"/>
-      <w:numFmt w:val="decimal"/>
-      <w:lvlText w:val="%2."/>
-      <w:lvlJc w:val="left"/>
-      <w:pPr>
-        <w:ind w:left="1440" w:hanging="360"/>
-      </w:pPr>
-    </w:lvl>
-    <w:lvl w:ilvl="2">
-      <w:start w:val="32"/>
-      <w:numFmt w:val="decimal"/>
-      <w:lvlText w:val="%3."/>
-      <w:lvlJc w:val="left"/>
-      <w:pPr>
-        <w:ind w:left="2160" w:hanging="360"/>
-      </w:pPr>
-    </w:lvl>
-    <w:lvl w:ilvl="3">
-      <w:start w:val="32"/>
-      <w:numFmt w:val="decimal"/>
-      <w:lvlText w:val="%4."/>
-      <w:lvlJc w:val="left"/>
-      <w:pPr>
-        <w:ind w:left="2880" w:hanging="360"/>
-      </w:pPr>
-    </w:lvl>
-    <w:lvl w:ilvl="4">
-      <w:start w:val="32"/>
-      <w:numFmt w:val="decimal"/>
-      <w:lvlText w:val="%5."/>
-      <w:lvlJc w:val="left"/>
-      <w:pPr>
-        <w:ind w:left="3600" w:hanging="360"/>
-      </w:pPr>
-    </w:lvl>
-    <w:lvl w:ilvl="5">
-      <w:start w:val="32"/>
-      <w:numFmt w:val="decimal"/>
-      <w:lvlText w:val="%6."/>
-      <w:lvlJc w:val="left"/>
-      <w:pPr>
-        <w:ind w:left="4320" w:hanging="360"/>
-      </w:pPr>
-    </w:lvl>
-    <w:lvl w:ilvl="6">
-      <w:start w:val="32"/>
-      <w:numFmt w:val="decimal"/>
-      <w:lvlText w:val="%7."/>
-      <w:lvlJc w:val="left"/>
-      <w:pPr>
-        <w:ind w:left="5040" w:hanging="360"/>
-      </w:pPr>
-    </w:lvl>
-    <w:lvl w:ilvl="7">
-      <w:start w:val="32"/>
-      <w:numFmt w:val="decimal"/>
-      <w:lvlText w:val="%8."/>
-      <w:lvlJc w:val="left"/>
-      <w:pPr>
-        <w:ind w:left="5760" w:hanging="360"/>
-      </w:pPr>
-    </w:lvl>
-    <w:lvl w:ilvl="8">
-      <w:start w:val="32"/>
+      <w:start w:val="28"/>
       <w:numFmt w:val="decimal"/>
       <w:lvlText w:val="%9."/>
       <w:lvlJc w:val="left"/>
@@ -6185,11 +6206,11 @@
       </w:pPr>
     </w:lvl>
   </w:abstractNum>
-  <w:abstractNum w:abstractNumId="994138">
-    <w:nsid w:val="0A994138"/>
+  <w:abstractNum w:abstractNumId="994135">
+    <w:nsid w:val="0A994135"/>
     <w:multiLevelType w:val="multilevel"/>
     <w:lvl w:ilvl="0">
-      <w:start w:val="38"/>
+      <w:start w:val="35"/>
       <w:numFmt w:val="decimal"/>
       <w:lvlText w:val="%1."/>
       <w:lvlJc w:val="left"/>
@@ -6198,7 +6219,7 @@
       </w:pPr>
     </w:lvl>
     <w:lvl w:ilvl="1">
-      <w:start w:val="38"/>
+      <w:start w:val="35"/>
       <w:numFmt w:val="decimal"/>
       <w:lvlText w:val="%2."/>
       <w:lvlJc w:val="left"/>
@@ -6207,7 +6228,7 @@
       </w:pPr>
     </w:lvl>
     <w:lvl w:ilvl="2">
-      <w:start w:val="38"/>
+      <w:start w:val="35"/>
       <w:numFmt w:val="decimal"/>
       <w:lvlText w:val="%3."/>
       <w:lvlJc w:val="left"/>
@@ -6216,7 +6237,7 @@
       </w:pPr>
     </w:lvl>
     <w:lvl w:ilvl="3">
-      <w:start w:val="38"/>
+      <w:start w:val="35"/>
       <w:numFmt w:val="decimal"/>
       <w:lvlText w:val="%4."/>
       <w:lvlJc w:val="left"/>
@@ -6225,7 +6246,7 @@
       </w:pPr>
     </w:lvl>
     <w:lvl w:ilvl="4">
-      <w:start w:val="38"/>
+      <w:start w:val="35"/>
       <w:numFmt w:val="decimal"/>
       <w:lvlText w:val="%5."/>
       <w:lvlJc w:val="left"/>
@@ -6234,7 +6255,7 @@
       </w:pPr>
     </w:lvl>
     <w:lvl w:ilvl="5">
-      <w:start w:val="38"/>
+      <w:start w:val="35"/>
       <w:numFmt w:val="decimal"/>
       <w:lvlText w:val="%6."/>
       <w:lvlJc w:val="left"/>
@@ -6243,7 +6264,7 @@
       </w:pPr>
     </w:lvl>
     <w:lvl w:ilvl="6">
-      <w:start w:val="38"/>
+      <w:start w:val="35"/>
       <w:numFmt w:val="decimal"/>
       <w:lvlText w:val="%7."/>
       <w:lvlJc w:val="left"/>
@@ -6252,7 +6273,7 @@
       </w:pPr>
     </w:lvl>
     <w:lvl w:ilvl="7">
-      <w:start w:val="38"/>
+      <w:start w:val="35"/>
       <w:numFmt w:val="decimal"/>
       <w:lvlText w:val="%8."/>
       <w:lvlJc w:val="left"/>
@@ -6261,7 +6282,7 @@
       </w:pPr>
     </w:lvl>
     <w:lvl w:ilvl="8">
-      <w:start w:val="38"/>
+      <w:start w:val="35"/>
       <w:numFmt w:val="decimal"/>
       <w:lvlText w:val="%9."/>
       <w:lvlJc w:val="left"/>
@@ -6355,11 +6376,11 @@
       </w:pPr>
     </w:lvl>
   </w:abstractNum>
-  <w:abstractNum w:abstractNumId="994141">
-    <w:nsid w:val="0A994141"/>
+  <w:abstractNum w:abstractNumId="994140">
+    <w:nsid w:val="0A994140"/>
     <w:multiLevelType w:val="multilevel"/>
     <w:lvl w:ilvl="0">
-      <w:start w:val="41"/>
+      <w:start w:val="40"/>
       <w:numFmt w:val="decimal"/>
       <w:lvlText w:val="%1."/>
       <w:lvlJc w:val="left"/>
@@ -6368,7 +6389,7 @@
       </w:pPr>
     </w:lvl>
     <w:lvl w:ilvl="1">
-      <w:start w:val="41"/>
+      <w:start w:val="40"/>
       <w:numFmt w:val="decimal"/>
       <w:lvlText w:val="%2."/>
       <w:lvlJc w:val="left"/>
@@ -6377,7 +6398,7 @@
       </w:pPr>
     </w:lvl>
     <w:lvl w:ilvl="2">
-      <w:start w:val="41"/>
+      <w:start w:val="40"/>
       <w:numFmt w:val="decimal"/>
       <w:lvlText w:val="%3."/>
       <w:lvlJc w:val="left"/>
@@ -6386,7 +6407,7 @@
       </w:pPr>
     </w:lvl>
     <w:lvl w:ilvl="3">
-      <w:start w:val="41"/>
+      <w:start w:val="40"/>
       <w:numFmt w:val="decimal"/>
       <w:lvlText w:val="%4."/>
       <w:lvlJc w:val="left"/>
@@ -6395,7 +6416,7 @@
       </w:pPr>
     </w:lvl>
     <w:lvl w:ilvl="4">
-      <w:start w:val="41"/>
+      <w:start w:val="40"/>
       <w:numFmt w:val="decimal"/>
       <w:lvlText w:val="%5."/>
       <w:lvlJc w:val="left"/>
@@ -6404,7 +6425,7 @@
       </w:pPr>
     </w:lvl>
     <w:lvl w:ilvl="5">
-      <w:start w:val="41"/>
+      <w:start w:val="40"/>
       <w:numFmt w:val="decimal"/>
       <w:lvlText w:val="%6."/>
       <w:lvlJc w:val="left"/>
@@ -6413,7 +6434,7 @@
       </w:pPr>
     </w:lvl>
     <w:lvl w:ilvl="6">
-      <w:start w:val="41"/>
+      <w:start w:val="40"/>
       <w:numFmt w:val="decimal"/>
       <w:lvlText w:val="%7."/>
       <w:lvlJc w:val="left"/>
@@ -6422,7 +6443,7 @@
       </w:pPr>
     </w:lvl>
     <w:lvl w:ilvl="7">
-      <w:start w:val="41"/>
+      <w:start w:val="40"/>
       <w:numFmt w:val="decimal"/>
       <w:lvlText w:val="%8."/>
       <w:lvlJc w:val="left"/>
@@ -6431,7 +6452,7 @@
       </w:pPr>
     </w:lvl>
     <w:lvl w:ilvl="8">
-      <w:start w:val="41"/>
+      <w:start w:val="40"/>
       <w:numFmt w:val="decimal"/>
       <w:lvlText w:val="%9."/>
       <w:lvlJc w:val="left"/>
@@ -6440,11 +6461,11 @@
       </w:pPr>
     </w:lvl>
   </w:abstractNum>
-  <w:abstractNum w:abstractNumId="994143">
-    <w:nsid w:val="0A994143"/>
+  <w:abstractNum w:abstractNumId="994142">
+    <w:nsid w:val="0A994142"/>
     <w:multiLevelType w:val="multilevel"/>
     <w:lvl w:ilvl="0">
-      <w:start w:val="43"/>
+      <w:start w:val="42"/>
       <w:numFmt w:val="decimal"/>
       <w:lvlText w:val="%1."/>
       <w:lvlJc w:val="left"/>
@@ -6453,7 +6474,7 @@
       </w:pPr>
     </w:lvl>
     <w:lvl w:ilvl="1">
-      <w:start w:val="43"/>
+      <w:start w:val="42"/>
       <w:numFmt w:val="decimal"/>
       <w:lvlText w:val="%2."/>
       <w:lvlJc w:val="left"/>
@@ -6462,7 +6483,7 @@
       </w:pPr>
     </w:lvl>
     <w:lvl w:ilvl="2">
-      <w:start w:val="43"/>
+      <w:start w:val="42"/>
       <w:numFmt w:val="decimal"/>
       <w:lvlText w:val="%3."/>
       <w:lvlJc w:val="left"/>
@@ -6471,7 +6492,7 @@
       </w:pPr>
     </w:lvl>
     <w:lvl w:ilvl="3">
-      <w:start w:val="43"/>
+      <w:start w:val="42"/>
       <w:numFmt w:val="decimal"/>
       <w:lvlText w:val="%4."/>
       <w:lvlJc w:val="left"/>
@@ -6480,7 +6501,7 @@
       </w:pPr>
     </w:lvl>
     <w:lvl w:ilvl="4">
-      <w:start w:val="43"/>
+      <w:start w:val="42"/>
       <w:numFmt w:val="decimal"/>
       <w:lvlText w:val="%5."/>
       <w:lvlJc w:val="left"/>
@@ -6489,7 +6510,7 @@
       </w:pPr>
     </w:lvl>
     <w:lvl w:ilvl="5">
-      <w:start w:val="43"/>
+      <w:start w:val="42"/>
       <w:numFmt w:val="decimal"/>
       <w:lvlText w:val="%6."/>
       <w:lvlJc w:val="left"/>
@@ -6498,7 +6519,7 @@
       </w:pPr>
     </w:lvl>
     <w:lvl w:ilvl="6">
-      <w:start w:val="43"/>
+      <w:start w:val="42"/>
       <w:numFmt w:val="decimal"/>
       <w:lvlText w:val="%7."/>
       <w:lvlJc w:val="left"/>
@@ -6507,7 +6528,7 @@
       </w:pPr>
     </w:lvl>
     <w:lvl w:ilvl="7">
-      <w:start w:val="43"/>
+      <w:start w:val="42"/>
       <w:numFmt w:val="decimal"/>
       <w:lvlText w:val="%8."/>
       <w:lvlJc w:val="left"/>
@@ -6516,7 +6537,92 @@
       </w:pPr>
     </w:lvl>
     <w:lvl w:ilvl="8">
-      <w:start w:val="43"/>
+      <w:start w:val="42"/>
+      <w:numFmt w:val="decimal"/>
+      <w:lvlText w:val="%9."/>
+      <w:lvlJc w:val="left"/>
+      <w:pPr>
+        <w:ind w:left="6480" w:hanging="360"/>
+      </w:pPr>
+    </w:lvl>
+  </w:abstractNum>
+  <w:abstractNum w:abstractNumId="994144">
+    <w:nsid w:val="0A994144"/>
+    <w:multiLevelType w:val="multilevel"/>
+    <w:lvl w:ilvl="0">
+      <w:start w:val="44"/>
+      <w:numFmt w:val="decimal"/>
+      <w:lvlText w:val="%1."/>
+      <w:lvlJc w:val="left"/>
+      <w:pPr>
+        <w:ind w:left="720" w:hanging="360"/>
+      </w:pPr>
+    </w:lvl>
+    <w:lvl w:ilvl="1">
+      <w:start w:val="44"/>
+      <w:numFmt w:val="decimal"/>
+      <w:lvlText w:val="%2."/>
+      <w:lvlJc w:val="left"/>
+      <w:pPr>
+        <w:ind w:left="1440" w:hanging="360"/>
+      </w:pPr>
+    </w:lvl>
+    <w:lvl w:ilvl="2">
+      <w:start w:val="44"/>
+      <w:numFmt w:val="decimal"/>
+      <w:lvlText w:val="%3."/>
+      <w:lvlJc w:val="left"/>
+      <w:pPr>
+        <w:ind w:left="2160" w:hanging="360"/>
+      </w:pPr>
+    </w:lvl>
+    <w:lvl w:ilvl="3">
+      <w:start w:val="44"/>
+      <w:numFmt w:val="decimal"/>
+      <w:lvlText w:val="%4."/>
+      <w:lvlJc w:val="left"/>
+      <w:pPr>
+        <w:ind w:left="2880" w:hanging="360"/>
+      </w:pPr>
+    </w:lvl>
+    <w:lvl w:ilvl="4">
+      <w:start w:val="44"/>
+      <w:numFmt w:val="decimal"/>
+      <w:lvlText w:val="%5."/>
+      <w:lvlJc w:val="left"/>
+      <w:pPr>
+        <w:ind w:left="3600" w:hanging="360"/>
+      </w:pPr>
+    </w:lvl>
+    <w:lvl w:ilvl="5">
+      <w:start w:val="44"/>
+      <w:numFmt w:val="decimal"/>
+      <w:lvlText w:val="%6."/>
+      <w:lvlJc w:val="left"/>
+      <w:pPr>
+        <w:ind w:left="4320" w:hanging="360"/>
+      </w:pPr>
+    </w:lvl>
+    <w:lvl w:ilvl="6">
+      <w:start w:val="44"/>
+      <w:numFmt w:val="decimal"/>
+      <w:lvlText w:val="%7."/>
+      <w:lvlJc w:val="left"/>
+      <w:pPr>
+        <w:ind w:left="5040" w:hanging="360"/>
+      </w:pPr>
+    </w:lvl>
+    <w:lvl w:ilvl="7">
+      <w:start w:val="44"/>
+      <w:numFmt w:val="decimal"/>
+      <w:lvlText w:val="%8."/>
+      <w:lvlJc w:val="left"/>
+      <w:pPr>
+        <w:ind w:left="5760" w:hanging="360"/>
+      </w:pPr>
+    </w:lvl>
+    <w:lvl w:ilvl="8">
+      <w:start w:val="44"/>
       <w:numFmt w:val="decimal"/>
       <w:lvlText w:val="%9."/>
       <w:lvlJc w:val="left"/>
@@ -6781,36 +6887,6 @@
     </w:lvlOverride>
   </w:num>
   <w:num w:numId="1011">
-    <w:abstractNumId w:val="994110"/>
-    <w:lvlOverride w:ilvl="0">
-      <w:startOverride w:val="10"/>
-    </w:lvlOverride>
-    <w:lvlOverride w:ilvl="1">
-      <w:startOverride w:val="10"/>
-    </w:lvlOverride>
-    <w:lvlOverride w:ilvl="2">
-      <w:startOverride w:val="10"/>
-    </w:lvlOverride>
-    <w:lvlOverride w:ilvl="3">
-      <w:startOverride w:val="10"/>
-    </w:lvlOverride>
-    <w:lvlOverride w:ilvl="4">
-      <w:startOverride w:val="10"/>
-    </w:lvlOverride>
-    <w:lvlOverride w:ilvl="5">
-      <w:startOverride w:val="10"/>
-    </w:lvlOverride>
-    <w:lvlOverride w:ilvl="6">
-      <w:startOverride w:val="10"/>
-    </w:lvlOverride>
-    <w:lvlOverride w:ilvl="7">
-      <w:startOverride w:val="10"/>
-    </w:lvlOverride>
-    <w:lvlOverride w:ilvl="8">
-      <w:startOverride w:val="10"/>
-    </w:lvlOverride>
-  </w:num>
-  <w:num w:numId="1012">
     <w:abstractNumId w:val="994111"/>
     <w:lvlOverride w:ilvl="0">
       <w:startOverride w:val="11"/>
@@ -6840,37 +6916,37 @@
       <w:startOverride w:val="11"/>
     </w:lvlOverride>
   </w:num>
+  <w:num w:numId="1012">
+    <w:abstractNumId w:val="994112"/>
+    <w:lvlOverride w:ilvl="0">
+      <w:startOverride w:val="12"/>
+    </w:lvlOverride>
+    <w:lvlOverride w:ilvl="1">
+      <w:startOverride w:val="12"/>
+    </w:lvlOverride>
+    <w:lvlOverride w:ilvl="2">
+      <w:startOverride w:val="12"/>
+    </w:lvlOverride>
+    <w:lvlOverride w:ilvl="3">
+      <w:startOverride w:val="12"/>
+    </w:lvlOverride>
+    <w:lvlOverride w:ilvl="4">
+      <w:startOverride w:val="12"/>
+    </w:lvlOverride>
+    <w:lvlOverride w:ilvl="5">
+      <w:startOverride w:val="12"/>
+    </w:lvlOverride>
+    <w:lvlOverride w:ilvl="6">
+      <w:startOverride w:val="12"/>
+    </w:lvlOverride>
+    <w:lvlOverride w:ilvl="7">
+      <w:startOverride w:val="12"/>
+    </w:lvlOverride>
+    <w:lvlOverride w:ilvl="8">
+      <w:startOverride w:val="12"/>
+    </w:lvlOverride>
+  </w:num>
   <w:num w:numId="1013">
-    <w:abstractNumId w:val="994116"/>
-    <w:lvlOverride w:ilvl="0">
-      <w:startOverride w:val="16"/>
-    </w:lvlOverride>
-    <w:lvlOverride w:ilvl="1">
-      <w:startOverride w:val="16"/>
-    </w:lvlOverride>
-    <w:lvlOverride w:ilvl="2">
-      <w:startOverride w:val="16"/>
-    </w:lvlOverride>
-    <w:lvlOverride w:ilvl="3">
-      <w:startOverride w:val="16"/>
-    </w:lvlOverride>
-    <w:lvlOverride w:ilvl="4">
-      <w:startOverride w:val="16"/>
-    </w:lvlOverride>
-    <w:lvlOverride w:ilvl="5">
-      <w:startOverride w:val="16"/>
-    </w:lvlOverride>
-    <w:lvlOverride w:ilvl="6">
-      <w:startOverride w:val="16"/>
-    </w:lvlOverride>
-    <w:lvlOverride w:ilvl="7">
-      <w:startOverride w:val="16"/>
-    </w:lvlOverride>
-    <w:lvlOverride w:ilvl="8">
-      <w:startOverride w:val="16"/>
-    </w:lvlOverride>
-  </w:num>
-  <w:num w:numId="1014">
     <w:abstractNumId w:val="994117"/>
     <w:lvlOverride w:ilvl="0">
       <w:startOverride w:val="17"/>
@@ -6900,64 +6976,94 @@
       <w:startOverride w:val="17"/>
     </w:lvlOverride>
   </w:num>
+  <w:num w:numId="1014">
+    <w:abstractNumId w:val="994118"/>
+    <w:lvlOverride w:ilvl="0">
+      <w:startOverride w:val="18"/>
+    </w:lvlOverride>
+    <w:lvlOverride w:ilvl="1">
+      <w:startOverride w:val="18"/>
+    </w:lvlOverride>
+    <w:lvlOverride w:ilvl="2">
+      <w:startOverride w:val="18"/>
+    </w:lvlOverride>
+    <w:lvlOverride w:ilvl="3">
+      <w:startOverride w:val="18"/>
+    </w:lvlOverride>
+    <w:lvlOverride w:ilvl="4">
+      <w:startOverride w:val="18"/>
+    </w:lvlOverride>
+    <w:lvlOverride w:ilvl="5">
+      <w:startOverride w:val="18"/>
+    </w:lvlOverride>
+    <w:lvlOverride w:ilvl="6">
+      <w:startOverride w:val="18"/>
+    </w:lvlOverride>
+    <w:lvlOverride w:ilvl="7">
+      <w:startOverride w:val="18"/>
+    </w:lvlOverride>
+    <w:lvlOverride w:ilvl="8">
+      <w:startOverride w:val="18"/>
+    </w:lvlOverride>
+  </w:num>
   <w:num w:numId="1015">
-    <w:abstractNumId w:val="994120"/>
+    <w:abstractNumId w:val="994121"/>
     <w:lvlOverride w:ilvl="0">
-      <w:startOverride w:val="20"/>
+      <w:startOverride w:val="21"/>
     </w:lvlOverride>
     <w:lvlOverride w:ilvl="1">
-      <w:startOverride w:val="20"/>
+      <w:startOverride w:val="21"/>
     </w:lvlOverride>
     <w:lvlOverride w:ilvl="2">
-      <w:startOverride w:val="20"/>
+      <w:startOverride w:val="21"/>
     </w:lvlOverride>
     <w:lvlOverride w:ilvl="3">
-      <w:startOverride w:val="20"/>
+      <w:startOverride w:val="21"/>
     </w:lvlOverride>
     <w:lvlOverride w:ilvl="4">
-      <w:startOverride w:val="20"/>
+      <w:startOverride w:val="21"/>
     </w:lvlOverride>
     <w:lvlOverride w:ilvl="5">
-      <w:startOverride w:val="20"/>
+      <w:startOverride w:val="21"/>
     </w:lvlOverride>
     <w:lvlOverride w:ilvl="6">
-      <w:startOverride w:val="20"/>
+      <w:startOverride w:val="21"/>
     </w:lvlOverride>
     <w:lvlOverride w:ilvl="7">
-      <w:startOverride w:val="20"/>
+      <w:startOverride w:val="21"/>
     </w:lvlOverride>
     <w:lvlOverride w:ilvl="8">
-      <w:startOverride w:val="20"/>
+      <w:startOverride w:val="21"/>
     </w:lvlOverride>
   </w:num>
   <w:num w:numId="1016">
-    <w:abstractNumId w:val="994124"/>
+    <w:abstractNumId w:val="994125"/>
     <w:lvlOverride w:ilvl="0">
-      <w:startOverride w:val="24"/>
+      <w:startOverride w:val="25"/>
     </w:lvlOverride>
     <w:lvlOverride w:ilvl="1">
-      <w:startOverride w:val="24"/>
+      <w:startOverride w:val="25"/>
     </w:lvlOverride>
     <w:lvlOverride w:ilvl="2">
-      <w:startOverride w:val="24"/>
+      <w:startOverride w:val="25"/>
     </w:lvlOverride>
     <w:lvlOverride w:ilvl="3">
-      <w:startOverride w:val="24"/>
+      <w:startOverride w:val="25"/>
     </w:lvlOverride>
     <w:lvlOverride w:ilvl="4">
-      <w:startOverride w:val="24"/>
+      <w:startOverride w:val="25"/>
     </w:lvlOverride>
     <w:lvlOverride w:ilvl="5">
-      <w:startOverride w:val="24"/>
+      <w:startOverride w:val="25"/>
     </w:lvlOverride>
     <w:lvlOverride w:ilvl="6">
-      <w:startOverride w:val="24"/>
+      <w:startOverride w:val="25"/>
     </w:lvlOverride>
     <w:lvlOverride w:ilvl="7">
-      <w:startOverride w:val="24"/>
+      <w:startOverride w:val="25"/>
     </w:lvlOverride>
     <w:lvlOverride w:ilvl="8">
-      <w:startOverride w:val="24"/>
+      <w:startOverride w:val="25"/>
     </w:lvlOverride>
   </w:num>
   <w:num w:numId="1017">
@@ -6991,33 +7097,33 @@
     </w:lvlOverride>
   </w:num>
   <w:num w:numId="1018">
-    <w:abstractNumId w:val="994127"/>
+    <w:abstractNumId w:val="994128"/>
     <w:lvlOverride w:ilvl="0">
-      <w:startOverride w:val="27"/>
+      <w:startOverride w:val="28"/>
     </w:lvlOverride>
     <w:lvlOverride w:ilvl="1">
-      <w:startOverride w:val="27"/>
+      <w:startOverride w:val="28"/>
     </w:lvlOverride>
     <w:lvlOverride w:ilvl="2">
-      <w:startOverride w:val="27"/>
+      <w:startOverride w:val="28"/>
     </w:lvlOverride>
     <w:lvlOverride w:ilvl="3">
-      <w:startOverride w:val="27"/>
+      <w:startOverride w:val="28"/>
     </w:lvlOverride>
     <w:lvlOverride w:ilvl="4">
-      <w:startOverride w:val="27"/>
+      <w:startOverride w:val="28"/>
     </w:lvlOverride>
     <w:lvlOverride w:ilvl="5">
-      <w:startOverride w:val="27"/>
+      <w:startOverride w:val="28"/>
     </w:lvlOverride>
     <w:lvlOverride w:ilvl="6">
-      <w:startOverride w:val="27"/>
+      <w:startOverride w:val="28"/>
     </w:lvlOverride>
     <w:lvlOverride w:ilvl="7">
-      <w:startOverride w:val="27"/>
+      <w:startOverride w:val="28"/>
     </w:lvlOverride>
     <w:lvlOverride w:ilvl="8">
-      <w:startOverride w:val="27"/>
+      <w:startOverride w:val="28"/>
     </w:lvlOverride>
   </w:num>
   <w:num w:numId="1019">
@@ -7051,36 +7157,6 @@
     </w:lvlOverride>
   </w:num>
   <w:num w:numId="1020">
-    <w:abstractNumId w:val="994132"/>
-    <w:lvlOverride w:ilvl="0">
-      <w:startOverride w:val="32"/>
-    </w:lvlOverride>
-    <w:lvlOverride w:ilvl="1">
-      <w:startOverride w:val="32"/>
-    </w:lvlOverride>
-    <w:lvlOverride w:ilvl="2">
-      <w:startOverride w:val="32"/>
-    </w:lvlOverride>
-    <w:lvlOverride w:ilvl="3">
-      <w:startOverride w:val="32"/>
-    </w:lvlOverride>
-    <w:lvlOverride w:ilvl="4">
-      <w:startOverride w:val="32"/>
-    </w:lvlOverride>
-    <w:lvlOverride w:ilvl="5">
-      <w:startOverride w:val="32"/>
-    </w:lvlOverride>
-    <w:lvlOverride w:ilvl="6">
-      <w:startOverride w:val="32"/>
-    </w:lvlOverride>
-    <w:lvlOverride w:ilvl="7">
-      <w:startOverride w:val="32"/>
-    </w:lvlOverride>
-    <w:lvlOverride w:ilvl="8">
-      <w:startOverride w:val="32"/>
-    </w:lvlOverride>
-  </w:num>
-  <w:num w:numId="1021">
     <w:abstractNumId w:val="994133"/>
     <w:lvlOverride w:ilvl="0">
       <w:startOverride w:val="33"/>
@@ -7110,7 +7186,7 @@
       <w:startOverride w:val="33"/>
     </w:lvlOverride>
   </w:num>
-  <w:num w:numId="1022">
+  <w:num w:numId="1021">
     <w:abstractNumId w:val="994134"/>
     <w:lvlOverride w:ilvl="0">
       <w:startOverride w:val="34"/>
@@ -7138,6 +7214,36 @@
     </w:lvlOverride>
     <w:lvlOverride w:ilvl="8">
       <w:startOverride w:val="34"/>
+    </w:lvlOverride>
+  </w:num>
+  <w:num w:numId="1022">
+    <w:abstractNumId w:val="994135"/>
+    <w:lvlOverride w:ilvl="0">
+      <w:startOverride w:val="35"/>
+    </w:lvlOverride>
+    <w:lvlOverride w:ilvl="1">
+      <w:startOverride w:val="35"/>
+    </w:lvlOverride>
+    <w:lvlOverride w:ilvl="2">
+      <w:startOverride w:val="35"/>
+    </w:lvlOverride>
+    <w:lvlOverride w:ilvl="3">
+      <w:startOverride w:val="35"/>
+    </w:lvlOverride>
+    <w:lvlOverride w:ilvl="4">
+      <w:startOverride w:val="35"/>
+    </w:lvlOverride>
+    <w:lvlOverride w:ilvl="5">
+      <w:startOverride w:val="35"/>
+    </w:lvlOverride>
+    <w:lvlOverride w:ilvl="6">
+      <w:startOverride w:val="35"/>
+    </w:lvlOverride>
+    <w:lvlOverride w:ilvl="7">
+      <w:startOverride w:val="35"/>
+    </w:lvlOverride>
+    <w:lvlOverride w:ilvl="8">
+      <w:startOverride w:val="35"/>
     </w:lvlOverride>
   </w:num>
   <w:num w:numId="1023">
@@ -7171,36 +7277,6 @@
     </w:lvlOverride>
   </w:num>
   <w:num w:numId="1024">
-    <w:abstractNumId w:val="994138"/>
-    <w:lvlOverride w:ilvl="0">
-      <w:startOverride w:val="38"/>
-    </w:lvlOverride>
-    <w:lvlOverride w:ilvl="1">
-      <w:startOverride w:val="38"/>
-    </w:lvlOverride>
-    <w:lvlOverride w:ilvl="2">
-      <w:startOverride w:val="38"/>
-    </w:lvlOverride>
-    <w:lvlOverride w:ilvl="3">
-      <w:startOverride w:val="38"/>
-    </w:lvlOverride>
-    <w:lvlOverride w:ilvl="4">
-      <w:startOverride w:val="38"/>
-    </w:lvlOverride>
-    <w:lvlOverride w:ilvl="5">
-      <w:startOverride w:val="38"/>
-    </w:lvlOverride>
-    <w:lvlOverride w:ilvl="6">
-      <w:startOverride w:val="38"/>
-    </w:lvlOverride>
-    <w:lvlOverride w:ilvl="7">
-      <w:startOverride w:val="38"/>
-    </w:lvlOverride>
-    <w:lvlOverride w:ilvl="8">
-      <w:startOverride w:val="38"/>
-    </w:lvlOverride>
-  </w:num>
-  <w:num w:numId="1025">
     <w:abstractNumId w:val="994139"/>
     <w:lvlOverride w:ilvl="0">
       <w:startOverride w:val="39"/>
@@ -7230,64 +7306,94 @@
       <w:startOverride w:val="39"/>
     </w:lvlOverride>
   </w:num>
+  <w:num w:numId="1025">
+    <w:abstractNumId w:val="994140"/>
+    <w:lvlOverride w:ilvl="0">
+      <w:startOverride w:val="40"/>
+    </w:lvlOverride>
+    <w:lvlOverride w:ilvl="1">
+      <w:startOverride w:val="40"/>
+    </w:lvlOverride>
+    <w:lvlOverride w:ilvl="2">
+      <w:startOverride w:val="40"/>
+    </w:lvlOverride>
+    <w:lvlOverride w:ilvl="3">
+      <w:startOverride w:val="40"/>
+    </w:lvlOverride>
+    <w:lvlOverride w:ilvl="4">
+      <w:startOverride w:val="40"/>
+    </w:lvlOverride>
+    <w:lvlOverride w:ilvl="5">
+      <w:startOverride w:val="40"/>
+    </w:lvlOverride>
+    <w:lvlOverride w:ilvl="6">
+      <w:startOverride w:val="40"/>
+    </w:lvlOverride>
+    <w:lvlOverride w:ilvl="7">
+      <w:startOverride w:val="40"/>
+    </w:lvlOverride>
+    <w:lvlOverride w:ilvl="8">
+      <w:startOverride w:val="40"/>
+    </w:lvlOverride>
+  </w:num>
   <w:num w:numId="1026">
-    <w:abstractNumId w:val="994141"/>
+    <w:abstractNumId w:val="994142"/>
     <w:lvlOverride w:ilvl="0">
-      <w:startOverride w:val="41"/>
+      <w:startOverride w:val="42"/>
     </w:lvlOverride>
     <w:lvlOverride w:ilvl="1">
-      <w:startOverride w:val="41"/>
+      <w:startOverride w:val="42"/>
     </w:lvlOverride>
     <w:lvlOverride w:ilvl="2">
-      <w:startOverride w:val="41"/>
+      <w:startOverride w:val="42"/>
     </w:lvlOverride>
     <w:lvlOverride w:ilvl="3">
-      <w:startOverride w:val="41"/>
+      <w:startOverride w:val="42"/>
     </w:lvlOverride>
     <w:lvlOverride w:ilvl="4">
-      <w:startOverride w:val="41"/>
+      <w:startOverride w:val="42"/>
     </w:lvlOverride>
     <w:lvlOverride w:ilvl="5">
-      <w:startOverride w:val="41"/>
+      <w:startOverride w:val="42"/>
     </w:lvlOverride>
     <w:lvlOverride w:ilvl="6">
-      <w:startOverride w:val="41"/>
+      <w:startOverride w:val="42"/>
     </w:lvlOverride>
     <w:lvlOverride w:ilvl="7">
-      <w:startOverride w:val="41"/>
+      <w:startOverride w:val="42"/>
     </w:lvlOverride>
     <w:lvlOverride w:ilvl="8">
-      <w:startOverride w:val="41"/>
+      <w:startOverride w:val="42"/>
     </w:lvlOverride>
   </w:num>
   <w:num w:numId="1027">
-    <w:abstractNumId w:val="994143"/>
+    <w:abstractNumId w:val="994144"/>
     <w:lvlOverride w:ilvl="0">
-      <w:startOverride w:val="43"/>
+      <w:startOverride w:val="44"/>
     </w:lvlOverride>
     <w:lvlOverride w:ilvl="1">
-      <w:startOverride w:val="43"/>
+      <w:startOverride w:val="44"/>
     </w:lvlOverride>
     <w:lvlOverride w:ilvl="2">
-      <w:startOverride w:val="43"/>
+      <w:startOverride w:val="44"/>
     </w:lvlOverride>
     <w:lvlOverride w:ilvl="3">
-      <w:startOverride w:val="43"/>
+      <w:startOverride w:val="44"/>
     </w:lvlOverride>
     <w:lvlOverride w:ilvl="4">
-      <w:startOverride w:val="43"/>
+      <w:startOverride w:val="44"/>
     </w:lvlOverride>
     <w:lvlOverride w:ilvl="5">
-      <w:startOverride w:val="43"/>
+      <w:startOverride w:val="44"/>
     </w:lvlOverride>
     <w:lvlOverride w:ilvl="6">
-      <w:startOverride w:val="43"/>
+      <w:startOverride w:val="44"/>
     </w:lvlOverride>
     <w:lvlOverride w:ilvl="7">
-      <w:startOverride w:val="43"/>
+      <w:startOverride w:val="44"/>
     </w:lvlOverride>
     <w:lvlOverride w:ilvl="8">
-      <w:startOverride w:val="43"/>
+      <w:startOverride w:val="44"/>
     </w:lvlOverride>
   </w:num>
 </w:numbering>

</xml_diff>

<commit_message>
writing module key and debugging reactivity again
</commit_message>
<xml_diff>
--- a/app/report.docx
+++ b/app/report.docx
@@ -2045,7 +2045,43 @@
         </w:numPr>
       </w:pPr>
       <w:r>
-        <w:t xml:space="preserve">Compare the R2 value between the one-day lag and the current value of your target variable with the R2 values you received when investigating relationships between environmental variables and the target variables in Objective 2, Q6. Which R2 value is the highest, and what does this mean about the relative importance of the one-day lag vs. environmental variables in predicting your target variable?</w:t>
+        <w:t xml:space="preserve">Compare the R</w:t>
+      </w:r>
+      <w:r>
+        <w:rPr>
+          <w:vertAlign w:val="superscript"/>
+        </w:rPr>
+        <w:t xml:space="preserve">2</w:t>
+      </w:r>
+      <w:r>
+        <w:t xml:space="preserve"> </w:t>
+      </w:r>
+      <w:r>
+        <w:t xml:space="preserve">value between the one-day lag and the current value of your target variable with the R</w:t>
+      </w:r>
+      <w:r>
+        <w:rPr>
+          <w:vertAlign w:val="superscript"/>
+        </w:rPr>
+        <w:t xml:space="preserve">2</w:t>
+      </w:r>
+      <w:r>
+        <w:t xml:space="preserve"> </w:t>
+      </w:r>
+      <w:r>
+        <w:t xml:space="preserve">values you received when investigating relationships between environmental variables and the target variables in Objective 2, Q6. Which R</w:t>
+      </w:r>
+      <w:r>
+        <w:rPr>
+          <w:vertAlign w:val="superscript"/>
+        </w:rPr>
+        <w:t xml:space="preserve">2</w:t>
+      </w:r>
+      <w:r>
+        <w:t xml:space="preserve"> </w:t>
+      </w:r>
+      <w:r>
+        <w:t xml:space="preserve">value is the highest, and what does this mean about the relative importance of the one-day lag vs. environmental variables in predicting your target variable?</w:t>
       </w:r>
       <w:r>
         <w:br/>
@@ -2234,7 +2270,7 @@
         <w:br/>
       </w:r>
       <w:r>
-        <w:t xml:space="preserve">a. Record the order of your ARIMA model printed above.:</w:t>
+        <w:t xml:space="preserve">a. Record the order of your ARIMA model printed above.</w:t>
       </w:r>
       <w:r>
         <w:br/>
@@ -2253,7 +2289,7 @@
         <w:br/>
       </w:r>
       <w:r>
-        <w:t xml:space="preserve">b. How many lags are included in the model? How do you know?:</w:t>
+        <w:t xml:space="preserve">b. How many lags are included in the model? How do you know?</w:t>
       </w:r>
       <w:r>
         <w:br/>
@@ -2272,7 +2308,7 @@
         <w:br/>
       </w:r>
       <w:r>
-        <w:t xml:space="preserve">c. Are the data differenced to fit the model? How do you know?:</w:t>
+        <w:t xml:space="preserve">c. Are the data differenced to fit the model? How do you know?</w:t>
       </w:r>
       <w:r>
         <w:br/>
@@ -2291,7 +2327,7 @@
         <w:br/>
       </w:r>
       <w:r>
-        <w:t xml:space="preserve">d. How many timesteps of previous errors are included in the model? How do you know?:</w:t>
+        <w:t xml:space="preserve">d. How many timesteps of previous errors are included in the model? How do you know?</w:t>
       </w:r>
       <w:r>
         <w:br/>

</xml_diff>

<commit_message>
final revisions and re-publishing
</commit_message>
<xml_diff>
--- a/app/report.docx
+++ b/app/report.docx
@@ -217,7 +217,7 @@
         <w:pStyle w:val="FirstParagraph"/>
       </w:pPr>
       <w:r>
-        <w:t xml:space="preserve">Advances in environmental sensor technology in recent decades are enabling the collection of environmental data at high temporal frequencies (e.g., every 10 minutes) across many ecosystems. These time series of environmental data can be used to gain information about previous and current conditions of ecosystems, as well as make predictions about ecosystem conditions in the future. To help researchers and managers understand the complex patterns that can occur in high-frequency environmental time series data, they commonly apply a range of time series models. These models use statistical and machine learning methods to identify signals in high-frequency environmental data.</w:t>
+        <w:t xml:space="preserve">Advances in environmental sensor technology in recent decades are enabling the collection of environmental data at high temporal frequencies (e.g., every 10 minutes) across many ecosystems. These time series of environmental data can be used to gain information about previous and current conditions of ecosystems, as well as make predictions about ecosystem conditions in the future. Researchers and managers commonly apply a range of time series models to understand the complex patterns that can occur in high-frequency environmental time series data. These models use statistical and machine learning methods to identify signals in high-frequency environmental data.</w:t>
       </w:r>
     </w:p>
     <w:p>
@@ -225,7 +225,7 @@
         <w:pStyle w:val="BodyText"/>
       </w:pPr>
       <w:r>
-        <w:t xml:space="preserve">In this module, students will apply several different time series and machine learning models to explore, analyze, and interpret environmental data. They will explore data from an environmental case study of their choice, choose which environmental variables to use to fit a time series model, assess the model, and apply the model to make predictions of future ecosystem conditions. Then, students will process a new dataset into a standardized format, upload it into the module’s R Shiny App, and fit several other models to compare predictive performance across models. Students will also evaluate the ecological understanding that can be drawn from each model (e.g., which driver variables are important for explaining the dynamics of the target environmental variable being predicted).</w:t>
+        <w:t xml:space="preserve">In this module, students will apply several different time series and machine learning models to explore, analyze, and interpret environmental data. They will explore data from an environmental case study of their choice, choose which environmental variables to use to fit a time series model, assess the model, and apply the model to make predictions of future ecosystem conditions. Then, students will process a new dataset into a standardized format, upload it into the module’s R Shiny App, and fit several other models to compare predictive performance across models. Students will also evaluate the ecological understanding that can be gained from each model (e.g., which driver variables are important for explaining the dynamics of the target environmental variable being predicted).</w:t>
       </w:r>
     </w:p>
     <w:bookmarkStart w:id="27" w:name="module-overview"/>
@@ -723,7 +723,7 @@
         </w:numPr>
       </w:pPr>
       <w:r>
-        <w:t xml:space="preserve">Why is close attention to data standards needed when using time series models in environmental science? What are the risks of not following data standards?</w:t>
+        <w:t xml:space="preserve">Why do you think it is important to make out-of-sample predictions when assessing the skill of time series models?</w:t>
       </w:r>
       <w:r>
         <w:br/>
@@ -1067,7 +1067,7 @@
         </w:numPr>
       </w:pPr>
       <w:r>
-        <w:t xml:space="preserve">Fill out the table below with the description of site variables:</w:t>
+        <w:t xml:space="preserve">Fill out the Q5 table in your Word document report with the descriptions of site variables.</w:t>
       </w:r>
       <w:r>
         <w:br/>
@@ -1596,7 +1596,7 @@
         </w:numPr>
       </w:pPr>
       <w:r>
-        <w:t xml:space="preserve">Describe the relationship between each driver variable and the target variable. For each variable, write in the table below whether increases in that driver variable are associated with increases in the target variable (positive relationship), decreases in the target variable (negative relationship), or no change in the target variable (no relationship).</w:t>
+        <w:t xml:space="preserve">In the Q6 table in your Word document report, describe the relationship between each driver variable and the target variable. For each variable, write in the table below whether increases in that driver variable are associated with increases in the target variable (positive relationship), decreases in the target variable (negative relationship), or no change in the target variable (no relationship).</w:t>
       </w:r>
       <w:r>
         <w:br/>
@@ -2105,7 +2105,16 @@
         </w:numPr>
       </w:pPr>
       <w:r>
-        <w:t xml:space="preserve">Observe the PACF (partial autocorrelation function) plot on the right. Based on this figure, how many lags of the target variable do you anticipate being included in the fitted ARIMA model? Explain your reasoning.</w:t>
+        <w:t xml:space="preserve">Observe the PACF (partial autocorrelation function) plot on the right.</w:t>
+      </w:r>
+      <w:r>
+        <w:br/>
+      </w:r>
+      <w:r>
+        <w:t xml:space="preserve">a. Based on this figure, how many lags of the target variable do you anticipate being included in the fitted ARIMA model? Explain your reasoning.</w:t>
+      </w:r>
+      <w:r>
+        <w:br/>
       </w:r>
       <w:r>
         <w:br/>
@@ -2120,6 +2129,25 @@
       <w:r>
         <w:br/>
       </w:r>
+      <w:r>
+        <w:br/>
+      </w:r>
+      <w:r>
+        <w:t xml:space="preserve">b. Use your answer to Q10a to estimate a good value for the p parameter in the ARIMA(p, d, q) model order for your chosen dataset. Explain your reasoning.</w:t>
+      </w:r>
+      <w:r>
+        <w:br/>
+      </w:r>
+      <w:r>
+        <w:br/>
+      </w:r>
+      <w:r>
+        <w:rPr>
+          <w:b/>
+          <w:bCs/>
+        </w:rPr>
+        <w:t xml:space="preserve">Answer:</w:t>
+      </w:r>
     </w:p>
     <w:p>
       <w:pPr>
@@ -2154,7 +2182,16 @@
         </w:numPr>
       </w:pPr>
       <w:r>
-        <w:t xml:space="preserve">Observe the plot on the right. Based on visual inspection, does differencing substantially improve the stationarity of the target variable data? Explain your reasoning.</w:t>
+        <w:t xml:space="preserve">Observe the plot on the right.</w:t>
+      </w:r>
+      <w:r>
+        <w:br/>
+      </w:r>
+      <w:r>
+        <w:t xml:space="preserve">a. Based on visual inspection, does differencing substantially improve the stationarity of the target variable data? Explain your reasoning.</w:t>
+      </w:r>
+      <w:r>
+        <w:br/>
       </w:r>
       <w:r>
         <w:br/>
@@ -2169,6 +2206,25 @@
       <w:r>
         <w:br/>
       </w:r>
+      <w:r>
+        <w:br/>
+      </w:r>
+      <w:r>
+        <w:t xml:space="preserve">b. Use your answer to Q11a to estimate a good value for the d parameter in the ARIMA(p, d, q) model order for your chosen dataset. Explain your reasoning.</w:t>
+      </w:r>
+      <w:r>
+        <w:br/>
+      </w:r>
+      <w:r>
+        <w:br/>
+      </w:r>
+      <w:r>
+        <w:rPr>
+          <w:b/>
+          <w:bCs/>
+        </w:rPr>
+        <w:t xml:space="preserve">Answer:</w:t>
+      </w:r>
     </w:p>
     <w:p>
       <w:pPr>
@@ -2669,7 +2725,7 @@
         <w:t xml:space="preserve"> </w:t>
       </w:r>
       <w:r>
-        <w:t xml:space="preserve">and record the value of the RMSE and ignorance score for your fitted ARIMA model.</w:t>
+        <w:t xml:space="preserve">and record the value of the RMSE and ignorance score for your fitted ARIMA model. Be sure to include the appropriate units for each score as part of your answer.</w:t>
       </w:r>
       <w:r>
         <w:br/>
@@ -2916,9 +2972,6 @@
         <w:t xml:space="preserve">‘variable’</w:t>
       </w:r>
       <w:r>
-        <w:t xml:space="preserve">.</w:t>
-      </w:r>
-      <w:r>
         <w:br/>
       </w:r>
       <w:r>
@@ -2959,7 +3012,7 @@
         <w:t xml:space="preserve"> </w:t>
       </w:r>
       <w:r>
-        <w:t xml:space="preserve">column, using Y for year, M for month, and D for day.</w:t>
+        <w:t xml:space="preserve">column, using Y for year, M for month, and D for day</w:t>
       </w:r>
       <w:r>
         <w:br/>
@@ -3237,19 +3290,17 @@
       <w:r>
         <w:br/>
       </w:r>
-      <w:r>
-        <w:br/>
-      </w:r>
-    </w:p>
-    <w:p>
-      <w:pPr>
+    </w:p>
+    <w:p>
+      <w:pPr>
+        <w:pStyle w:val="Compact"/>
         <w:numPr>
-          <w:ilvl w:val="0"/>
-          <w:numId w:val="1018"/>
+          <w:ilvl w:val="1"/>
+          <w:numId w:val="1019"/>
         </w:numPr>
       </w:pPr>
       <w:r>
-        <w:t xml:space="preserve">Which term is most important in your fitted model (i.e., has the greatest absolute value)?</w:t>
+        <w:t xml:space="preserve">How similar or different is the order of your ARIMA model to the model you fit in Activity A? Why do you think this is the case?</w:t>
       </w:r>
       <w:r>
         <w:br/>
@@ -3267,6 +3318,39 @@
       <w:r>
         <w:br/>
       </w:r>
+      <w:r>
+        <w:br/>
+      </w:r>
+      <w:r>
+        <w:br/>
+      </w:r>
+    </w:p>
+    <w:p>
+      <w:pPr>
+        <w:numPr>
+          <w:ilvl w:val="0"/>
+          <w:numId w:val="1018"/>
+        </w:numPr>
+      </w:pPr>
+      <w:r>
+        <w:t xml:space="preserve">Which term is most important in your fitted model (i.e., has the greatest absolute value)?</w:t>
+      </w:r>
+      <w:r>
+        <w:br/>
+      </w:r>
+      <w:r>
+        <w:br/>
+      </w:r>
+      <w:r>
+        <w:rPr>
+          <w:b/>
+          <w:bCs/>
+        </w:rPr>
+        <w:t xml:space="preserve">Answer:</w:t>
+      </w:r>
+      <w:r>
+        <w:br/>
+      </w:r>
     </w:p>
     <w:bookmarkEnd w:id="49"/>
     <w:bookmarkStart w:id="50" w:name="objective-8-assess-model-fit"/>
@@ -3364,7 +3448,7 @@
         </w:numPr>
       </w:pPr>
       <w:r>
-        <w:t xml:space="preserve">Record the RMSE and ignorance score for your model.</w:t>
+        <w:t xml:space="preserve">Record the RMSE and ignorance score for your model. Be sure to include the appropriate units for each score as part of your answer.</w:t>
       </w:r>
       <w:r>
         <w:br/>
@@ -4120,6 +4204,33 @@
       </w:pPr>
       <w:r>
         <w:t xml:space="preserve">Did the more complex models (ARIMA, NNETAR) perform better than the historical mean and/or DOY models? What does this result indicate about the importance of using more complex models (and exogenous regressors if you chose to include them) for predicting the target variable in your chosen dataset?</w:t>
+      </w:r>
+      <w:r>
+        <w:br/>
+      </w:r>
+      <w:r>
+        <w:br/>
+      </w:r>
+      <w:r>
+        <w:rPr>
+          <w:b/>
+          <w:bCs/>
+        </w:rPr>
+        <w:t xml:space="preserve">Answer:</w:t>
+      </w:r>
+      <w:r>
+        <w:br/>
+      </w:r>
+    </w:p>
+    <w:p>
+      <w:pPr>
+        <w:numPr>
+          <w:ilvl w:val="0"/>
+          <w:numId w:val="1027"/>
+        </w:numPr>
+      </w:pPr>
+      <w:r>
+        <w:t xml:space="preserve">Use one or both of the peer-reviewed articles provided above (Tredennick et al. is open-access) to help you think of at least one way in which complex ecological models can be useful even if they do not beat simple null models when it comes to prediction of ecological variables.</w:t>
       </w:r>
       <w:r>
         <w:br/>

</xml_diff>